<commit_message>
Update typeset 第五章.docx based on manual JSON fixes
</commit_message>
<xml_diff>
--- a/第五章/第五章.docx
+++ b/第五章/第五章.docx
@@ -259,21 +259,6 @@
           <w:b w:val="0"/>
           <w:sz w:val="24"/>
         </w:rPr>
-        <w:t>發文日期:八十八年八月三十日發文字號:(八八)工程企字第八八一二八五四號</w:t>
-      </w:r>
-    </w:p>
-    <w:p>
-      <w:pPr>
-        <w:pStyle w:val="a9"/>
-        <w:ind w:left="720" w:hanging="720"/>
-        <w:jc w:val="both"/>
-      </w:pPr>
-      <w:r>
-        <w:rPr>
-          <w:rFonts w:ascii="新細明體" w:hAnsi="新細明體" w:eastAsia="新細明體"/>
-          <w:b w:val="0"/>
-          <w:sz w:val="24"/>
-        </w:rPr>
         <w:t>主旨：查核金額以上之採購，以公開招標方式辦理第三次以後之開標，其投標廠商家數不受限制，亦即有廠商投標即可開標，免先報經上級機關核准，復請查照。</w:t>
       </w:r>
     </w:p>
@@ -320,21 +305,6 @@
           <w:b w:val="0"/>
           <w:sz w:val="24"/>
         </w:rPr>
-        <w:t>發文日期:八十八年九月四日發文字號:(八八)工程企字第八八一二四七一號</w:t>
-      </w:r>
-    </w:p>
-    <w:p>
-      <w:pPr>
-        <w:pStyle w:val="a9"/>
-        <w:ind w:left="720" w:hanging="720"/>
-        <w:jc w:val="both"/>
-      </w:pPr>
-      <w:r>
-        <w:rPr>
-          <w:rFonts w:ascii="新細明體" w:hAnsi="新細明體" w:eastAsia="新細明體"/>
-          <w:b w:val="0"/>
-          <w:sz w:val="24"/>
-        </w:rPr>
         <w:t>主旨：貴所請釋政府採購法第四十九條執行疑義乙案，復請查照。</w:t>
       </w:r>
     </w:p>
@@ -507,31 +477,16 @@
     <w:p>
       <w:pPr>
         <w:pStyle w:val="a9"/>
-        <w:ind w:left="960" w:hanging="960"/>
-        <w:jc w:val="both"/>
-      </w:pPr>
-      <w:r>
-        <w:rPr>
-          <w:rFonts w:ascii="新細明體" w:hAnsi="新細明體" w:eastAsia="新細明體"/>
-          <w:b w:val="0"/>
-          <w:sz w:val="24"/>
-        </w:rPr>
-        <w:t>備註：1. 「註」：本函說明二所述「擇定符合需要者進行比價或議價前，得免開標程序」乙節，於本會九十一年五月三日（九一）工程企字第九一〇一七三九四號令修正公布「中央機關未達公告金額採購招標辦法」第四條第一項已有明定。</w:t>
-      </w:r>
-    </w:p>
-    <w:p>
-      <w:pPr>
-        <w:pStyle w:val="a9"/>
-        <w:ind w:left="960" w:hanging="240"/>
-        <w:jc w:val="both"/>
-      </w:pPr>
-      <w:r>
-        <w:rPr>
-          <w:rFonts w:ascii="新細明體" w:hAnsi="新細明體" w:eastAsia="新細明體"/>
-          <w:b w:val="0"/>
-          <w:sz w:val="24"/>
-        </w:rPr>
-        <w:t>2. 「註」：本函說明二所述「擇定符合需要者進行比價或議價前，得免開標程序」乙節，於本會本會九十一年五月三日（九一）工程企字第九一○一七三九四號令修正公布「中央機關未達公告金額採購招標辦法」第四條第一項已有明定。</w:t>
+        <w:ind w:left="720" w:hanging="720"/>
+        <w:jc w:val="both"/>
+      </w:pPr>
+      <w:r>
+        <w:rPr>
+          <w:rFonts w:ascii="新細明體" w:hAnsi="新細明體" w:eastAsia="新細明體"/>
+          <w:b w:val="0"/>
+          <w:sz w:val="24"/>
+        </w:rPr>
+        <w:t>備註：1. 本函說明二所述「擇定符合需要者進行比價或議價前，得免開標程序」乙節，於本會九十一年五月三日（九一）工程企字第九一〇一七三九四號令修正公布「中央機關未達公告金額採購招標辦法」第四條第一項已有明定。</w:t>
       </w:r>
     </w:p>
     <w:p/>
@@ -749,31 +704,16 @@
     <w:p>
       <w:pPr>
         <w:pStyle w:val="a9"/>
-        <w:ind w:left="960" w:hanging="960"/>
-        <w:jc w:val="both"/>
-      </w:pPr>
-      <w:r>
-        <w:rPr>
-          <w:rFonts w:ascii="新細明體" w:hAnsi="新細明體" w:eastAsia="新細明體"/>
-          <w:b w:val="0"/>
-          <w:sz w:val="24"/>
-        </w:rPr>
-        <w:t>備註：1. 「註」：依本會九十一年九月二十五日（九一）工程企字第〇九一〇〇四〇一九五〇號令修正公布「中央機關未達公告金額採購招標辦法」，本函說明三所述該辦法「第二條第三款」應配合修正為「第二條第一項第二款」。</w:t>
-      </w:r>
-    </w:p>
-    <w:p>
-      <w:pPr>
-        <w:pStyle w:val="a9"/>
-        <w:ind w:left="960" w:hanging="240"/>
-        <w:jc w:val="both"/>
-      </w:pPr>
-      <w:r>
-        <w:rPr>
-          <w:rFonts w:ascii="新細明體" w:hAnsi="新細明體" w:eastAsia="新細明體"/>
-          <w:b w:val="0"/>
-          <w:sz w:val="24"/>
-        </w:rPr>
-        <w:t>2. 「註」：依本會九十一年九月二十五日（九一）工程企字第○九一○○四○一九五○號令修正公布「中央機關未達公告金額採購招標辦法」，本函說明三所述該辦法「第二條第三款」應配合修正為「第二條第一項第二款」。</w:t>
+        <w:ind w:left="720" w:hanging="720"/>
+        <w:jc w:val="both"/>
+      </w:pPr>
+      <w:r>
+        <w:rPr>
+          <w:rFonts w:ascii="新細明體" w:hAnsi="新細明體" w:eastAsia="新細明體"/>
+          <w:b w:val="0"/>
+          <w:sz w:val="24"/>
+        </w:rPr>
+        <w:t>備註：1. 依本會九十一年九月二十五日（九一）工程企字第〇九一〇〇四〇一九五〇號令修正公布「中央機關未達公告金額採購招標辦法」，本函說明三所述該辦法「第二條第三款」應配合修正為「第二條第一項第二款」。</w:t>
       </w:r>
     </w:p>
     <w:p/>
@@ -1651,67 +1591,7 @@
           <w:b w:val="0"/>
           <w:sz w:val="24"/>
         </w:rPr>
-        <w:t>一、政府採購法(下稱採購法)施行細則第55條明定「本法第四十八條第一項所稱三家以上合格廠商投標，指機關辦理公開招標，有三家以上廠商投標，且符合下列規定者：</w:t>
-      </w:r>
-    </w:p>
-    <w:p>
-      <w:pPr>
-        <w:pStyle w:val="a9"/>
-        <w:ind w:left="720" w:hanging="480"/>
-        <w:jc w:val="both"/>
-      </w:pPr>
-      <w:r>
-        <w:rPr>
-          <w:rFonts w:ascii="新細明體" w:hAnsi="新細明體" w:eastAsia="新細明體"/>
-          <w:b w:val="0"/>
-          <w:sz w:val="24"/>
-        </w:rPr>
-        <w:t>一、依本法第三十三條規定將投標文件送達於招標機關或其指定之場所。</w:t>
-      </w:r>
-    </w:p>
-    <w:p>
-      <w:pPr>
-        <w:pStyle w:val="a9"/>
-        <w:ind w:left="720" w:hanging="480"/>
-        <w:jc w:val="both"/>
-      </w:pPr>
-      <w:r>
-        <w:rPr>
-          <w:rFonts w:ascii="新細明體" w:hAnsi="新細明體" w:eastAsia="新細明體"/>
-          <w:b w:val="0"/>
-          <w:sz w:val="24"/>
-        </w:rPr>
-        <w:t>二、無本法第五十條第一項規定不予開標之情形。</w:t>
-      </w:r>
-    </w:p>
-    <w:p>
-      <w:pPr>
-        <w:pStyle w:val="a9"/>
-        <w:ind w:left="720" w:hanging="480"/>
-        <w:jc w:val="both"/>
-      </w:pPr>
-      <w:r>
-        <w:rPr>
-          <w:rFonts w:ascii="新細明體" w:hAnsi="新細明體" w:eastAsia="新細明體"/>
-          <w:b w:val="0"/>
-          <w:sz w:val="24"/>
-        </w:rPr>
-        <w:t>三、無第三十三條第一項及第二項規定不予開標之情形。</w:t>
-      </w:r>
-    </w:p>
-    <w:p>
-      <w:pPr>
-        <w:pStyle w:val="a9"/>
-        <w:ind w:left="720" w:hanging="480"/>
-        <w:jc w:val="both"/>
-      </w:pPr>
-      <w:r>
-        <w:rPr>
-          <w:rFonts w:ascii="新細明體" w:hAnsi="新細明體" w:eastAsia="新細明體"/>
-          <w:b w:val="0"/>
-          <w:sz w:val="24"/>
-        </w:rPr>
-        <w:t>四、無第三十八條第一項規定不得參加投標之情形。」其中第2款所指無採購法第50條第1項不予「開標」，應包含若投標廠商之標封外型依採購法第50條第1項認定有該項各款情形之一者，則依採購法施行細則第55條第2款規定，該廠商不計入採購法第48條第1項之合格廠商家數。</w:t>
+        <w:t>一、政府採購法(下稱採購法)施行細則第55條明定「本法第四十八條第一項所稱三家以上合格廠商投標，指機關辦理公開招標，有三家以上廠商投標，且符合下列規定者：一、依本法第三十三條規定將投標文件送達於招標機關或其指定之場所。二、無本法第五十條第一項規定不予開標之情形。三、無第三十三條第一項及第二項規定不予開標之情形。四、無第三十八條第一項規定不得參加投標之情形。」其中第2款所指無採購法第50條第1項不予「開標」，應包含若投標廠商之標封外型依採購法第50條第1項認定有該項各款情形之一者，則依採購法施行細則第55條第2款規定，該廠商不計入採購法第48條第1項之合格廠商家數。</w:t>
       </w:r>
     </w:p>
     <w:p>
@@ -1953,37 +1833,7 @@
           <w:b w:val="0"/>
           <w:sz w:val="24"/>
         </w:rPr>
-        <w:t>一、政府採購法(下稱採購法)第48條第1項第6款及第7款規定：「機關依本法規定辦理招標，除有下列情形之一不予開標決標外，有三家以上合格廠商投標，即應依招標文件所定時間開標決標：</w:t>
-      </w:r>
-    </w:p>
-    <w:p>
-      <w:pPr>
-        <w:pStyle w:val="a9"/>
-        <w:ind w:left="720" w:hanging="480"/>
-        <w:jc w:val="both"/>
-      </w:pPr>
-      <w:r>
-        <w:rPr>
-          <w:rFonts w:ascii="新細明體" w:hAnsi="新細明體" w:eastAsia="新細明體"/>
-          <w:b w:val="0"/>
-          <w:sz w:val="24"/>
-        </w:rPr>
-        <w:t>六、因應突發事故者。</w:t>
-      </w:r>
-    </w:p>
-    <w:p>
-      <w:pPr>
-        <w:pStyle w:val="a9"/>
-        <w:ind w:left="720" w:hanging="480"/>
-        <w:jc w:val="both"/>
-      </w:pPr>
-      <w:r>
-        <w:rPr>
-          <w:rFonts w:ascii="新細明體" w:hAnsi="新細明體" w:eastAsia="新細明體"/>
-          <w:b w:val="0"/>
-          <w:sz w:val="24"/>
-        </w:rPr>
-        <w:t>七、採購計畫變更或取銷採購者。」</w:t>
+        <w:t>一、政府採購法(下稱採購法)第48條第1項第6款及第7款規定：「機關依本法規定辦理招標，除有下列情形之一不予開標決標外，有三家以上合格廠商投標，即應依招標文件所定時間開標決標：六、因應突發事故者。七、採購計畫變更或取銷採購者。」</w:t>
       </w:r>
     </w:p>
     <w:p>
@@ -2104,7 +1954,52 @@
           <w:b w:val="0"/>
           <w:sz w:val="24"/>
         </w:rPr>
-        <w:t>主旨：因應嚴重特殊傳染性肺炎（COVID-19）疫情，各機關得採視訊方式辦理與廠商之相關會議，請查照。說明：一、依據本會110年6月4日召開之「研商工程技術顧問業受COVID-19疫情影響之因應措施會議」結論事項辦理。二、為配合旨揭疫情警戒期間之防疫措施，降低人員移動或接觸之風險，各機關辦理採購開標、決標等相關會議，得採同步網路視訊方式辦理，本會110年5月18日工程企字第1100100299號函、109年5月1日工程企字第1090008229號函、109年4月27日工程企字第1090008271號函（公開於本會網站，https://planpe.pcc.gov.tw/prms/）已有說明。另履約過程中進度協調、期中或期末審查等會議，機關亦得比照前述方式以視訊方式辦理，以避免影響履約進度，及維護訂約雙方權益。</w:t>
+        <w:t>主旨：因應嚴重特殊傳染性肺炎（COVID-19）疫情，各機關得採視訊方式辦理與廠商之相關會議，請查照。</w:t>
+      </w:r>
+    </w:p>
+    <w:p>
+      <w:pPr>
+        <w:pStyle w:val="a9"/>
+        <w:ind w:left="720" w:hanging="720"/>
+        <w:jc w:val="both"/>
+      </w:pPr>
+      <w:r>
+        <w:rPr>
+          <w:rFonts w:ascii="新細明體" w:hAnsi="新細明體" w:eastAsia="新細明體"/>
+          <w:b w:val="0"/>
+          <w:sz w:val="24"/>
+        </w:rPr>
+        <w:t>說明：</w:t>
+      </w:r>
+    </w:p>
+    <w:p>
+      <w:pPr>
+        <w:pStyle w:val="a9"/>
+        <w:ind w:left="720" w:hanging="480"/>
+        <w:jc w:val="both"/>
+      </w:pPr>
+      <w:r>
+        <w:rPr>
+          <w:rFonts w:ascii="新細明體" w:hAnsi="新細明體" w:eastAsia="新細明體"/>
+          <w:b w:val="0"/>
+          <w:sz w:val="24"/>
+        </w:rPr>
+        <w:t>一、依據本會110年6月4日召開之「研商工程技術顧問業受COVID-19疫情影響之因應措施會議」結論事項辦理。</w:t>
+      </w:r>
+    </w:p>
+    <w:p>
+      <w:pPr>
+        <w:pStyle w:val="a9"/>
+        <w:ind w:left="720" w:hanging="480"/>
+        <w:jc w:val="both"/>
+      </w:pPr>
+      <w:r>
+        <w:rPr>
+          <w:rFonts w:ascii="新細明體" w:hAnsi="新細明體" w:eastAsia="新細明體"/>
+          <w:b w:val="0"/>
+          <w:sz w:val="24"/>
+        </w:rPr>
+        <w:t>二、為配合旨揭疫情警戒期間之防疫措施，降低人員移動或接觸之風險，各機關辦理採購開標、決標等相關會議，得採同步網路視訊方式辦理，本會110年5月18日工程企字第1100100299號函、109年5月1日工程企字第1090008229號函、109年4月27日工程企字第1090008271號函（公開於本會網站，https://planpe.pcc.gov.tw/prms/）已有說明。另履約過程中進度協調、期中或期末審查等會議，機關亦得比照前述方式以視訊方式辦理，以避免影響履約進度，及維護訂約雙方權益。</w:t>
       </w:r>
     </w:p>
     <w:p/>
@@ -2531,7 +2426,37 @@
           <w:b w:val="0"/>
           <w:sz w:val="24"/>
         </w:rPr>
-        <w:t>一、貴處96年6月23日第601號傳真函收悉。二、關於政府採購法第50條第1項第5款規定，係為防止假性競爭之情形。依來函所述個案採分項決標，且地址、傳真、電話相同之二家廠商各投不同項目，尚非彼此互相競爭，自無上開條款之適用。惟仍請查察原招標文件有無限制單一廠商投標或得標之項次數，及同法施行細則第33條規定。二、爾後對政府採購法若有任何問題，請先至本會網站(http://www.pcc.gov.tw)\政府採購\政府採購法規\逐條釋例或相關解釋函查閱；如仍有疑義，請向服務單位採購主管或上級機關採購專責單位洽詢。</w:t>
+        <w:t>一、貴處96年6月23日第601號傳真函收悉。</w:t>
+      </w:r>
+    </w:p>
+    <w:p>
+      <w:pPr>
+        <w:pStyle w:val="a9"/>
+        <w:ind w:left="720" w:hanging="480"/>
+        <w:jc w:val="both"/>
+      </w:pPr>
+      <w:r>
+        <w:rPr>
+          <w:rFonts w:ascii="新細明體" w:hAnsi="新細明體" w:eastAsia="新細明體"/>
+          <w:b w:val="0"/>
+          <w:sz w:val="24"/>
+        </w:rPr>
+        <w:t>二、關於政府採購法第50條第1項第5款規定，係為防止假性競爭之情形。依來函所述個案採分項決標，且地址、傳真、電話相同之二家廠商各投不同項目，尚非彼此互相競爭，自無上開條款之適用。惟仍請查察原招標文件有無限制單一廠商投標或得標之項次數，及同法施行細則第33條規定。</w:t>
+      </w:r>
+    </w:p>
+    <w:p>
+      <w:pPr>
+        <w:pStyle w:val="a9"/>
+        <w:ind w:left="720" w:hanging="480"/>
+        <w:jc w:val="both"/>
+      </w:pPr>
+      <w:r>
+        <w:rPr>
+          <w:rFonts w:ascii="新細明體" w:hAnsi="新細明體" w:eastAsia="新細明體"/>
+          <w:b w:val="0"/>
+          <w:sz w:val="24"/>
+        </w:rPr>
+        <w:t>三、爾後對政府採購法若有任何問題，請先至本會網站(http://www.pcc.gov.tw)\政府採購\政府採購法規\逐條釋例或相關解釋函查閱；如仍有疑義，請向服務單位採購主管或上級機關採購專責單位洽詢。</w:t>
       </w:r>
     </w:p>
     <w:p>
@@ -2879,67 +2804,7 @@
           <w:b w:val="0"/>
           <w:sz w:val="24"/>
         </w:rPr>
-        <w:t>二、本法第50條第1項第5款所稱「不同投標廠商間之投標文件內容有重大異常關聯者」，本會91年11月27日工程企字第09100516820號令已列舉如下：「1.投標文件內容由同一人或同一廠商繕寫或備具者。</w:t>
-      </w:r>
-    </w:p>
-    <w:p>
-      <w:pPr>
-        <w:pStyle w:val="a9"/>
-        <w:ind w:left="1225" w:hanging="397"/>
-        <w:jc w:val="both"/>
-      </w:pPr>
-      <w:r>
-        <w:rPr>
-          <w:rFonts w:ascii="新細明體" w:hAnsi="新細明體" w:eastAsia="新細明體"/>
-          <w:b w:val="0"/>
-          <w:sz w:val="24"/>
-        </w:rPr>
-        <w:t>2.押標金由同一人或同一廠商繳納或申請退還者。</w:t>
-      </w:r>
-    </w:p>
-    <w:p>
-      <w:pPr>
-        <w:pStyle w:val="a9"/>
-        <w:ind w:left="1225" w:hanging="397"/>
-        <w:jc w:val="both"/>
-      </w:pPr>
-      <w:r>
-        <w:rPr>
-          <w:rFonts w:ascii="新細明體" w:hAnsi="新細明體" w:eastAsia="新細明體"/>
-          <w:b w:val="0"/>
-          <w:sz w:val="24"/>
-        </w:rPr>
-        <w:t>3.投標標封或通知機關信函號碼連號，顯係同一人或同一廠商所為者。</w:t>
-      </w:r>
-    </w:p>
-    <w:p>
-      <w:pPr>
-        <w:pStyle w:val="a9"/>
-        <w:ind w:left="1225" w:hanging="397"/>
-        <w:jc w:val="both"/>
-      </w:pPr>
-      <w:r>
-        <w:rPr>
-          <w:rFonts w:ascii="新細明體" w:hAnsi="新細明體" w:eastAsia="新細明體"/>
-          <w:b w:val="0"/>
-          <w:sz w:val="24"/>
-        </w:rPr>
-        <w:t>4.廠商地址、電話號碼、傳真機號碼、聯絡人或電子郵件網址相同者。</w:t>
-      </w:r>
-    </w:p>
-    <w:p>
-      <w:pPr>
-        <w:pStyle w:val="a9"/>
-        <w:ind w:left="1225" w:hanging="397"/>
-        <w:jc w:val="both"/>
-      </w:pPr>
-      <w:r>
-        <w:rPr>
-          <w:rFonts w:ascii="新細明體" w:hAnsi="新細明體" w:eastAsia="新細明體"/>
-          <w:b w:val="0"/>
-          <w:sz w:val="24"/>
-        </w:rPr>
-        <w:t>5.其他顯係同一人或同一廠商所為之情形者」（公開於本會網站），具關係企業關係之廠商參與同一採購案投標，如非屬上開情形，即無該款之適用。至於本法第48條第1項第2款所定「足以影響採購公正之違法或不當行為」，並非具關係企業關係之廠商投標即該當該款情形。</w:t>
+        <w:t>二、本法第50條第1項第5款所稱「不同投標廠商間之投標文件內容有重大異常關聯者」，本會91年11月27日工程企字第09100516820號令已列舉如下：「1.投標文件內容由同一人或同一廠商繕寫或備具者。2.押標金由同一人或同一廠商繳納或申請退還者。3.投標標封或通知機關信函號碼連號，顯係同一人或同一廠商所為者。4.廠商地址、電話號碼、傳真機號碼、聯絡人或電子郵件網址相同者。5.其他顯係同一人或同一廠商所為之情形者」（公開於本會網站），具關係企業關係之廠商參與同一採購案投標，如非屬上開情形，即無該款之適用。至於本法第48條第1項第2款所定「足以影響採購公正之違法或不當行為」，並非具關係企業關係之廠商投標即該當該款情形。</w:t>
       </w:r>
     </w:p>
     <w:p>
@@ -3015,82 +2880,7 @@
           <w:b w:val="0"/>
           <w:sz w:val="24"/>
         </w:rPr>
-        <w:t>一、本會95年7月25日工程企字第09500256920號令：「機關辦理採購，有3家以上合格廠商投標，開標後有2家以上廠商有下列情形之一，致僅餘一家廠商符合招標文件規定者，得依政府採購法第48條第1項第2款『發現有足以影響採購公正之違法或不當行為者』或第50條第1項第7款『其他影響採購公正之違反法令行為』處理：</w:t>
-      </w:r>
-    </w:p>
-    <w:p>
-      <w:pPr>
-        <w:pStyle w:val="a9"/>
-        <w:ind w:left="720" w:hanging="480"/>
-        <w:jc w:val="both"/>
-      </w:pPr>
-      <w:r>
-        <w:rPr>
-          <w:rFonts w:ascii="新細明體" w:hAnsi="新細明體" w:eastAsia="新細明體"/>
-          <w:b w:val="0"/>
-          <w:sz w:val="24"/>
-        </w:rPr>
-        <w:t>一、押標金未附或不符合規定。</w:t>
-      </w:r>
-    </w:p>
-    <w:p>
-      <w:pPr>
-        <w:pStyle w:val="a9"/>
-        <w:ind w:left="720" w:hanging="480"/>
-        <w:jc w:val="both"/>
-      </w:pPr>
-      <w:r>
-        <w:rPr>
-          <w:rFonts w:ascii="新細明體" w:hAnsi="新細明體" w:eastAsia="新細明體"/>
-          <w:b w:val="0"/>
-          <w:sz w:val="24"/>
-        </w:rPr>
-        <w:t>二、投標文件為空白文件、無關文件或標封內空無一物。</w:t>
-      </w:r>
-    </w:p>
-    <w:p>
-      <w:pPr>
-        <w:pStyle w:val="a9"/>
-        <w:ind w:left="720" w:hanging="480"/>
-        <w:jc w:val="both"/>
-      </w:pPr>
-      <w:r>
-        <w:rPr>
-          <w:rFonts w:ascii="新細明體" w:hAnsi="新細明體" w:eastAsia="新細明體"/>
-          <w:b w:val="0"/>
-          <w:sz w:val="24"/>
-        </w:rPr>
-        <w:t>三、資格、規格或價格文件未附或不符合規定。</w:t>
-      </w:r>
-    </w:p>
-    <w:p>
-      <w:pPr>
-        <w:pStyle w:val="a9"/>
-        <w:ind w:left="720" w:hanging="480"/>
-        <w:jc w:val="both"/>
-      </w:pPr>
-      <w:r>
-        <w:rPr>
-          <w:rFonts w:ascii="新細明體" w:hAnsi="新細明體" w:eastAsia="新細明體"/>
-          <w:b w:val="0"/>
-          <w:sz w:val="24"/>
-        </w:rPr>
-        <w:t>四、標價高於公告之預算或公告之底價。</w:t>
-      </w:r>
-    </w:p>
-    <w:p>
-      <w:pPr>
-        <w:pStyle w:val="a9"/>
-        <w:ind w:left="720" w:hanging="480"/>
-        <w:jc w:val="both"/>
-      </w:pPr>
-      <w:r>
-        <w:rPr>
-          <w:rFonts w:ascii="新細明體" w:hAnsi="新細明體" w:eastAsia="新細明體"/>
-          <w:b w:val="0"/>
-          <w:sz w:val="24"/>
-        </w:rPr>
-        <w:t>五、其他疑似刻意造成不合格標之情形。」（公開於本會網站）</w:t>
+        <w:t>一、本會95年7月25日工程企字第09500256920號令：「機關辦理採購，有3家以上合格廠商投標，開標後有2家以上廠商有下列情形之一，致僅餘一家廠商符合招標文件規定者，得依政府採購法第48條第1項第2款『發現有足以影響採購公正之違法或不當行為者』或第50條第1項第7款『其他影響採購公正之違反法令行為』處理：一、押標金未附或不符合規定。二、投標文件為空白文件、無關文件或標封內空無一物。三、資格、規格或價格文件未附或不符合規定。四、標價高於公告之預算或公告之底價。五、其他疑似刻意造成不合格標之情形。」（公開於本會網站）</w:t>
       </w:r>
     </w:p>
     <w:p>
@@ -3445,31 +3235,16 @@
     <w:p>
       <w:pPr>
         <w:pStyle w:val="a9"/>
-        <w:ind w:left="960" w:hanging="960"/>
-        <w:jc w:val="both"/>
-      </w:pPr>
-      <w:r>
-        <w:rPr>
-          <w:rFonts w:ascii="新細明體" w:hAnsi="新細明體" w:eastAsia="新細明體"/>
-          <w:b w:val="0"/>
-          <w:sz w:val="24"/>
-        </w:rPr>
-        <w:t>備註：1. 「註」：「招標期限標準」業經本會九十一年五月八日（九一）工程企字第九一〇一七六九四號令修正公布，本函說明二後段修正為「….，其等標期得酌予縮短，但依「招標期限標準」第八條之規定，不得少於三日。」</w:t>
-      </w:r>
-    </w:p>
-    <w:p>
-      <w:pPr>
-        <w:pStyle w:val="a9"/>
-        <w:ind w:left="960" w:hanging="240"/>
-        <w:jc w:val="both"/>
-      </w:pPr>
-      <w:r>
-        <w:rPr>
-          <w:rFonts w:ascii="新細明體" w:hAnsi="新細明體" w:eastAsia="新細明體"/>
-          <w:b w:val="0"/>
-          <w:sz w:val="24"/>
-        </w:rPr>
-        <w:t>2. 「註」：「招標期限標準」業經本會九十一年五月八日（九一）工程企字第九一○一七六九四號令修正公布，本函說明二後段修正為「….，其等標期得酌予縮短，但依「招標期限標準」第八條之規定，不得少於三日。」</w:t>
+        <w:ind w:left="720" w:hanging="720"/>
+        <w:jc w:val="both"/>
+      </w:pPr>
+      <w:r>
+        <w:rPr>
+          <w:rFonts w:ascii="新細明體" w:hAnsi="新細明體" w:eastAsia="新細明體"/>
+          <w:b w:val="0"/>
+          <w:sz w:val="24"/>
+        </w:rPr>
+        <w:t>備註：1. 「招標期限標準」業經本會九十一年五月八日（九一）工程企字第九一〇一七六九四號令修正公布，本函說明二後段修正為「….，其等標期得酌予縮短，但依「招標期限標準」第八條之規定，不得少於三日。」</w:t>
       </w:r>
     </w:p>
     <w:p/>
@@ -3909,7 +3684,82 @@
           <w:b w:val="0"/>
           <w:sz w:val="24"/>
         </w:rPr>
-        <w:t>機關辦理採購有下列情形之一者，得依政府採購法第五十條第一項第五款「不同投標廠商間之投標文件內容有重大異常關聯者」處理：一、投標文件內容由同一人或同一廠商繕寫或備具者。二、押標金由同一人或同一廠商繳納或申請退還者。三、投標標封或通知機關信函號碼連號，顯係同一人或同一廠商所為者。四、廠商地址、電話號碼、傳真機號碼、聯絡人或電子郵件網址相同者。五、其他顯係同一人或同一廠商所為之情形者。</w:t>
+        <w:t>機關辦理採購有下列情形之一者，得依政府採購法第五十條第一項第五款「不同投標廠商間之投標文件內容有重大異常關聯者」處理：</w:t>
+      </w:r>
+    </w:p>
+    <w:p>
+      <w:pPr>
+        <w:pStyle w:val="a9"/>
+        <w:ind w:left="720" w:hanging="480"/>
+        <w:jc w:val="both"/>
+      </w:pPr>
+      <w:r>
+        <w:rPr>
+          <w:rFonts w:ascii="新細明體" w:hAnsi="新細明體" w:eastAsia="新細明體"/>
+          <w:b w:val="0"/>
+          <w:sz w:val="24"/>
+        </w:rPr>
+        <w:t>一、投標文件內容由同一人或同一廠商繕寫或備具者。</w:t>
+      </w:r>
+    </w:p>
+    <w:p>
+      <w:pPr>
+        <w:pStyle w:val="a9"/>
+        <w:ind w:left="720" w:hanging="480"/>
+        <w:jc w:val="both"/>
+      </w:pPr>
+      <w:r>
+        <w:rPr>
+          <w:rFonts w:ascii="新細明體" w:hAnsi="新細明體" w:eastAsia="新細明體"/>
+          <w:b w:val="0"/>
+          <w:sz w:val="24"/>
+        </w:rPr>
+        <w:t>二、押標金由同一人或同一廠商繳納或申請退還者。</w:t>
+      </w:r>
+    </w:p>
+    <w:p>
+      <w:pPr>
+        <w:pStyle w:val="a9"/>
+        <w:ind w:left="720" w:hanging="480"/>
+        <w:jc w:val="both"/>
+      </w:pPr>
+      <w:r>
+        <w:rPr>
+          <w:rFonts w:ascii="新細明體" w:hAnsi="新細明體" w:eastAsia="新細明體"/>
+          <w:b w:val="0"/>
+          <w:sz w:val="24"/>
+        </w:rPr>
+        <w:t>三、投標標封或通知機關信函號碼連號，顯係同一人或同一廠商所為者。</w:t>
+      </w:r>
+    </w:p>
+    <w:p>
+      <w:pPr>
+        <w:pStyle w:val="a9"/>
+        <w:ind w:left="720" w:hanging="480"/>
+        <w:jc w:val="both"/>
+      </w:pPr>
+      <w:r>
+        <w:rPr>
+          <w:rFonts w:ascii="新細明體" w:hAnsi="新細明體" w:eastAsia="新細明體"/>
+          <w:b w:val="0"/>
+          <w:sz w:val="24"/>
+        </w:rPr>
+        <w:t>四、廠商地址、電話號碼、傳真機號碼、聯絡人或電子郵件網址相同者。</w:t>
+      </w:r>
+    </w:p>
+    <w:p>
+      <w:pPr>
+        <w:pStyle w:val="a9"/>
+        <w:ind w:left="720" w:hanging="480"/>
+        <w:jc w:val="both"/>
+      </w:pPr>
+      <w:r>
+        <w:rPr>
+          <w:rFonts w:ascii="新細明體" w:hAnsi="新細明體" w:eastAsia="新細明體"/>
+          <w:b w:val="0"/>
+          <w:sz w:val="24"/>
+        </w:rPr>
+        <w:t>五、其他顯係同一人或同一廠商所為之情形者。</w:t>
       </w:r>
     </w:p>
     <w:p/>
@@ -4242,7 +4092,7 @@
           <w:b w:val="0"/>
           <w:sz w:val="24"/>
         </w:rPr>
-        <w:t>備註：1. 一、政府採購法第31條第2項第8款「其他經主管機關認定有影響採購公正之違反法令行為」，本會已於104年7月17日以工程企字第10400225210號令發布。</w:t>
+        <w:t>備註：1. 政府採購法第31條第2項第8款「其他經主管機關認定有影響採購公正之違反法令行為」，本會已於104年7月17日以工程企字第10400225210號令發布。</w:t>
       </w:r>
     </w:p>
     <w:p>
@@ -4257,7 +4107,7 @@
           <w:b w:val="0"/>
           <w:sz w:val="24"/>
         </w:rPr>
-        <w:t>2. 二、108年5月22日總統華總一義字第10800049691號令公布修正政府採購法第31條，該條第2項第8款移列為第7款。另「依政府採購法第三十一條第二項第七款認定屬影響採購公正之違反法令行為」，業經本會108年9月16日工程企字第1080100733號令修正發布。</w:t>
+        <w:t>2. 108年5月22日總統華總一義字第10800049691號令公布修正政府採購法第31條，該條第2項第8款移列為第7款。另「依政府採購法第三十一條第二項第七款認定屬影響採購公正之違反法令行為」，業經本會108年9月16日工程企字第1080100733號令修正發布。</w:t>
       </w:r>
     </w:p>
     <w:p>
@@ -4272,7 +4122,7 @@
           <w:b w:val="0"/>
           <w:sz w:val="24"/>
         </w:rPr>
-        <w:t>3. 三、「依政府採購法第三十一條第二項第七款認定屬影響採購公正之違反法令行為」，本會業於114年7月10日工程企字第 1140100343號令修正發布。</w:t>
+        <w:t>3. 「依政府採購法第三十一條第二項第七款認定屬影響採購公正之違反法令行為」，本會業於114年7月10日工程企字第 1140100343號令修正發布。</w:t>
       </w:r>
     </w:p>
     <w:p/>
@@ -4698,7 +4548,82 @@
           <w:b w:val="0"/>
           <w:sz w:val="24"/>
         </w:rPr>
-        <w:t>機關辦理採購，有3家以上合格廠商投標，開標後有2家以上廠商有下列情形之一，致僅餘一家廠商符合招標文件規定者，得依政府採購法第48條第1項第2款「發現有足以影響採購公正之違法或不當行為者」或第50條第1項第7款「其他影響採購公正之違反法令行為」處理：一、押標金未附或不符合規定。二、投標文件為空白文件、無關文件或標封內空無一物。三、資格、規格或價格文件未附或不符合規定。四、標價高於公告之預算或公告之底價。五、其他疑似刻意造成不合格標之情形。</w:t>
+        <w:t>機關辦理採購，有3家以上合格廠商投標，開標後有2家以上廠商有下列情形之一，致僅餘一家廠商符合招標文件規定者，得依政府採購法第48條第1項第2款「發現有足以影響採購公正之違法或不當行為者」或第50條第1項第7款「其他影響採購公正之違反法令行為」處理：</w:t>
+      </w:r>
+    </w:p>
+    <w:p>
+      <w:pPr>
+        <w:pStyle w:val="a9"/>
+        <w:ind w:left="720" w:hanging="480"/>
+        <w:jc w:val="both"/>
+      </w:pPr>
+      <w:r>
+        <w:rPr>
+          <w:rFonts w:ascii="新細明體" w:hAnsi="新細明體" w:eastAsia="新細明體"/>
+          <w:b w:val="0"/>
+          <w:sz w:val="24"/>
+        </w:rPr>
+        <w:t>一、押標金未附或不符合規定。</w:t>
+      </w:r>
+    </w:p>
+    <w:p>
+      <w:pPr>
+        <w:pStyle w:val="a9"/>
+        <w:ind w:left="720" w:hanging="480"/>
+        <w:jc w:val="both"/>
+      </w:pPr>
+      <w:r>
+        <w:rPr>
+          <w:rFonts w:ascii="新細明體" w:hAnsi="新細明體" w:eastAsia="新細明體"/>
+          <w:b w:val="0"/>
+          <w:sz w:val="24"/>
+        </w:rPr>
+        <w:t>二、投標文件為空白文件、無關文件或標封內空無一物。</w:t>
+      </w:r>
+    </w:p>
+    <w:p>
+      <w:pPr>
+        <w:pStyle w:val="a9"/>
+        <w:ind w:left="720" w:hanging="480"/>
+        <w:jc w:val="both"/>
+      </w:pPr>
+      <w:r>
+        <w:rPr>
+          <w:rFonts w:ascii="新細明體" w:hAnsi="新細明體" w:eastAsia="新細明體"/>
+          <w:b w:val="0"/>
+          <w:sz w:val="24"/>
+        </w:rPr>
+        <w:t>三、資格、規格或價格文件未附或不符合規定。</w:t>
+      </w:r>
+    </w:p>
+    <w:p>
+      <w:pPr>
+        <w:pStyle w:val="a9"/>
+        <w:ind w:left="720" w:hanging="480"/>
+        <w:jc w:val="both"/>
+      </w:pPr>
+      <w:r>
+        <w:rPr>
+          <w:rFonts w:ascii="新細明體" w:hAnsi="新細明體" w:eastAsia="新細明體"/>
+          <w:b w:val="0"/>
+          <w:sz w:val="24"/>
+        </w:rPr>
+        <w:t>四、標價高於公告之預算或公告之底價。</w:t>
+      </w:r>
+    </w:p>
+    <w:p>
+      <w:pPr>
+        <w:pStyle w:val="a9"/>
+        <w:ind w:left="720" w:hanging="480"/>
+        <w:jc w:val="both"/>
+      </w:pPr>
+      <w:r>
+        <w:rPr>
+          <w:rFonts w:ascii="新細明體" w:hAnsi="新細明體" w:eastAsia="新細明體"/>
+          <w:b w:val="0"/>
+          <w:sz w:val="24"/>
+        </w:rPr>
+        <w:t>五、其他疑似刻意造成不合格標之情形。</w:t>
       </w:r>
     </w:p>
     <w:p/>
@@ -4819,7 +4744,7 @@
           <w:b w:val="0"/>
           <w:sz w:val="24"/>
         </w:rPr>
-        <w:t>2. 「依政府採購法第三十一條第二項第七款認定屬影響採購公正之違反法令行為」，本會業於114年7月10日工程企字第 1140100343號令修正發布</w:t>
+        <w:t>2. 「依政府採購法第三十一條第二項第七款認定屬影響採購公正之違反法令行為」，本會業於114年7月10日工程企字第 1140100343號令修正發布。</w:t>
       </w:r>
     </w:p>
     <w:p/>
@@ -5047,7 +4972,67 @@
           <w:b w:val="0"/>
           <w:sz w:val="24"/>
         </w:rPr>
-        <w:t>機關辦理採購，不得於招標文件規定廠商之投標文件有下列情形之一者，為不合格標。其有規定者，該部分無效。一、投標文件未檢附願繳納差額保證金之切結書。二、投標文件之頁數或紙張大小與招標文件規定不符。三、不分段開標之投標文件未依招標文件規定分置資格、規格或價格標封。四、投標文件未使用機關提供之封套。</w:t>
+        <w:t>機關辦理採購，不得於招標文件規定廠商之投標文件有下列情形之一者，為不合格標。其有規定者，該部分無效。</w:t>
+      </w:r>
+    </w:p>
+    <w:p>
+      <w:pPr>
+        <w:pStyle w:val="a9"/>
+        <w:ind w:left="720" w:hanging="480"/>
+        <w:jc w:val="both"/>
+      </w:pPr>
+      <w:r>
+        <w:rPr>
+          <w:rFonts w:ascii="新細明體" w:hAnsi="新細明體" w:eastAsia="新細明體"/>
+          <w:b w:val="0"/>
+          <w:sz w:val="24"/>
+        </w:rPr>
+        <w:t>一、投標文件未檢附願繳納差額保證金之切結書。</w:t>
+      </w:r>
+    </w:p>
+    <w:p>
+      <w:pPr>
+        <w:pStyle w:val="a9"/>
+        <w:ind w:left="720" w:hanging="480"/>
+        <w:jc w:val="both"/>
+      </w:pPr>
+      <w:r>
+        <w:rPr>
+          <w:rFonts w:ascii="新細明體" w:hAnsi="新細明體" w:eastAsia="新細明體"/>
+          <w:b w:val="0"/>
+          <w:sz w:val="24"/>
+        </w:rPr>
+        <w:t>二、投標文件之頁數或紙張大小與招標文件規定不符。</w:t>
+      </w:r>
+    </w:p>
+    <w:p>
+      <w:pPr>
+        <w:pStyle w:val="a9"/>
+        <w:ind w:left="720" w:hanging="480"/>
+        <w:jc w:val="both"/>
+      </w:pPr>
+      <w:r>
+        <w:rPr>
+          <w:rFonts w:ascii="新細明體" w:hAnsi="新細明體" w:eastAsia="新細明體"/>
+          <w:b w:val="0"/>
+          <w:sz w:val="24"/>
+        </w:rPr>
+        <w:t>三、不分段開標之投標文件未依招標文件規定分置資格、規格或價格標封。</w:t>
+      </w:r>
+    </w:p>
+    <w:p>
+      <w:pPr>
+        <w:pStyle w:val="a9"/>
+        <w:ind w:left="720" w:hanging="480"/>
+        <w:jc w:val="both"/>
+      </w:pPr>
+      <w:r>
+        <w:rPr>
+          <w:rFonts w:ascii="新細明體" w:hAnsi="新細明體" w:eastAsia="新細明體"/>
+          <w:b w:val="0"/>
+          <w:sz w:val="24"/>
+        </w:rPr>
+        <w:t>四、投標文件未使用機關提供之封套。</w:t>
       </w:r>
     </w:p>
     <w:p/>
@@ -5213,7 +5198,7 @@
           <w:b w:val="0"/>
           <w:sz w:val="24"/>
         </w:rPr>
-        <w:t>備註：1. 「投標廠商資格與特殊或巨額採購認定標準」業經本會98年11月11日工程企字第09800493780號令修正發布施行，按上開標準第3條第5項已增訂「...營業&amp;#31246;或所得稅之納稅證明，得以與上開最近一期或前一期證明相同期間內主管稽徵機關核發之無違章欠稅之查復表代之。」</w:t>
+        <w:t>備註：1. 「投標廠商資格與特殊或巨額採購認定標準」業經本會98年11月11日工程企字第09800493780號令修正發布施行，按上開標準第3條第5項已增訂「...營業稅或所得稅之納稅證明，得以與上開最近一期或前一期證明相同期間內主管稽徵機關核發之無違章欠稅之查復表代之。」</w:t>
       </w:r>
     </w:p>
     <w:p/>
@@ -5745,22 +5730,7 @@
           <w:b w:val="0"/>
           <w:sz w:val="24"/>
         </w:rPr>
-        <w:t>（一）採購法第50條第1項第6款規定：「投標廠商有下列情形之一，經機關於開標前發現者，其所投之標應不予開標；於開標後發現者，應不決標予該廠商：</w:t>
-      </w:r>
-    </w:p>
-    <w:p>
-      <w:pPr>
-        <w:pStyle w:val="a9"/>
-        <w:ind w:left="720" w:hanging="480"/>
-        <w:jc w:val="both"/>
-      </w:pPr>
-      <w:r>
-        <w:rPr>
-          <w:rFonts w:ascii="新細明體" w:hAnsi="新細明體" w:eastAsia="新細明體"/>
-          <w:b w:val="0"/>
-          <w:sz w:val="24"/>
-        </w:rPr>
-        <w:t>六、第一百零三條第一項不得參加投標或作為決標對象之情形。」第103條第1項規定：「依前條第三項規定刊登於政府採購公報之廠商，於下列期間內，不得參加投標或作為決標對象或作為決標對象或分包廠商：......」。</w:t>
+        <w:t>（一）採購法第50條第1項第6款規定：「投標廠商有下列情形之一，經機關於開標前發現者，其所投之標應不予開標；於開標後發現者，應不決標予該廠商：六、第一百零三條第一項不得參加投標或作為決標對象之情形。」第103條第1項規定：「依前條第三項規定刊登於政府採購公報之廠商，於下列期間內，不得參加投標或作為決標對象或作為決標對象或分包廠商：......」。</w:t>
       </w:r>
     </w:p>
     <w:p>
@@ -6183,7 +6153,67 @@
           <w:b w:val="0"/>
           <w:sz w:val="24"/>
         </w:rPr>
-        <w:t>修正本會九十六年五月八日工程企字第〇九六〇〇一八二五六〇號令之內容如下：機關辦理採購，不得於招標文件規定廠商之投標文件有下列情形之一者，為不合格標；其有規定者，該部分無效：一、標封封口未蓋騎縫章。二、投標文件未逐頁蓋章。三、投標文件之編排、字體大小、裝訂方式、正副本標示或份數與招標文件規定不符。</w:t>
+        <w:t>修正本會九十六年五月八日工程企字第〇九六〇〇一八二五六〇號令之內容如下：</w:t>
+      </w:r>
+    </w:p>
+    <w:p>
+      <w:pPr>
+        <w:pStyle w:val="a9"/>
+        <w:ind w:left="720" w:hanging="720"/>
+        <w:jc w:val="both"/>
+      </w:pPr>
+      <w:r>
+        <w:rPr>
+          <w:rFonts w:ascii="新細明體" w:hAnsi="新細明體" w:eastAsia="新細明體"/>
+          <w:b w:val="0"/>
+          <w:sz w:val="24"/>
+        </w:rPr>
+        <w:t>機關辦理採購，不得於招標文件規定廠商之投標文件有下列情形之一者，為不合格標；其有規定者，該部分無效：</w:t>
+      </w:r>
+    </w:p>
+    <w:p>
+      <w:pPr>
+        <w:pStyle w:val="a9"/>
+        <w:ind w:left="720" w:hanging="480"/>
+        <w:jc w:val="both"/>
+      </w:pPr>
+      <w:r>
+        <w:rPr>
+          <w:rFonts w:ascii="新細明體" w:hAnsi="新細明體" w:eastAsia="新細明體"/>
+          <w:b w:val="0"/>
+          <w:sz w:val="24"/>
+        </w:rPr>
+        <w:t>一、標封封口未蓋騎縫章。</w:t>
+      </w:r>
+    </w:p>
+    <w:p>
+      <w:pPr>
+        <w:pStyle w:val="a9"/>
+        <w:ind w:left="720" w:hanging="480"/>
+        <w:jc w:val="both"/>
+      </w:pPr>
+      <w:r>
+        <w:rPr>
+          <w:rFonts w:ascii="新細明體" w:hAnsi="新細明體" w:eastAsia="新細明體"/>
+          <w:b w:val="0"/>
+          <w:sz w:val="24"/>
+        </w:rPr>
+        <w:t>二、投標文件未逐頁蓋章。</w:t>
+      </w:r>
+    </w:p>
+    <w:p>
+      <w:pPr>
+        <w:pStyle w:val="a9"/>
+        <w:ind w:left="720" w:hanging="480"/>
+        <w:jc w:val="both"/>
+      </w:pPr>
+      <w:r>
+        <w:rPr>
+          <w:rFonts w:ascii="新細明體" w:hAnsi="新細明體" w:eastAsia="新細明體"/>
+          <w:b w:val="0"/>
+          <w:sz w:val="24"/>
+        </w:rPr>
+        <w:t>三、投標文件之編排、字體大小、裝訂方式、正副本標示或份數與招標文件規定不符。</w:t>
       </w:r>
     </w:p>
     <w:p/>
@@ -6259,22 +6289,7 @@
           <w:b w:val="0"/>
           <w:sz w:val="24"/>
         </w:rPr>
-        <w:t>二、查採購法第60條之立法</w:t>
-      </w:r>
-    </w:p>
-    <w:p>
-      <w:pPr>
-        <w:pStyle w:val="a9"/>
-        <w:ind w:left="720" w:hanging="720"/>
-        <w:jc w:val="both"/>
-      </w:pPr>
-      <w:r>
-        <w:rPr>
-          <w:rFonts w:ascii="新細明體" w:hAnsi="新細明體" w:eastAsia="新細明體"/>
-          <w:b w:val="0"/>
-          <w:sz w:val="24"/>
-        </w:rPr>
-        <w:t>說明：「審標、決標之過程，可能需要通知廠商辦理之事項，已分別規定於第五十一條、第五十三條、第五十四條及第五十七條。本條規定廠商未依機關之通知辦理，視同放棄，以資明確，並杜爭議，有利審標、決標程序之進行。」機關依採購法第51條、第53條、第54條及第57條規定通知廠商到場說明、減價、比減價格、協商、更改原報內容或重新報價，縱招標文件已預先載明開標時間、地點，及廠商未於開標時間到場以備辦理採購法第51條、第53條、第54條或第57條規定作業者，視同放棄之文字，而機關於開標時遇有需依前開規定辦理之事項，對於該未到場之廠商，仍應先踐行通知程序（通知該廠商限期到場），該廠商未到場，始得依採購法第60條規定視同放棄。</w:t>
+        <w:t>二、查採購法第60條之立法說明：「審標、決標之過程，可能需要通知廠商辦理之事項，已分別規定於第五十一條、第五十三條、第五十四條及第五十七條。本條規定廠商未依機關之通知辦理，視同放棄，以資明確，並杜爭議，有利審標、決標程序之進行。」機關依採購法第51條、第53條、第54條及第57條規定通知廠商到場說明、減價、比減價格、協商、更改原報內容或重新報價，縱招標文件已預先載明開標時間、地點，及廠商未於開標時間到場以備辦理採購法第51條、第53條、第54條或第57條規定作業者，視同放棄之文字，而機關於開標時遇有需依前開規定辦理之事項，對於該未到場之廠商，仍應先踐行通知程序（通知該廠商限期到場），該廠商未到場，始得依採購法第60條規定視同放棄。</w:t>
       </w:r>
     </w:p>
     <w:p>
@@ -6365,22 +6380,7 @@
           <w:b w:val="0"/>
           <w:sz w:val="24"/>
         </w:rPr>
-        <w:t>二、按政府採購法（下稱採購法）第60條之立法</w:t>
-      </w:r>
-    </w:p>
-    <w:p>
-      <w:pPr>
-        <w:pStyle w:val="a9"/>
-        <w:ind w:left="720" w:hanging="720"/>
-        <w:jc w:val="both"/>
-      </w:pPr>
-      <w:r>
-        <w:rPr>
-          <w:rFonts w:ascii="新細明體" w:hAnsi="新細明體" w:eastAsia="新細明體"/>
-          <w:b w:val="0"/>
-          <w:sz w:val="24"/>
-        </w:rPr>
-        <w:t>說明：「審標、決標之過程，可能需要通知廠商辦理之事項，已分別規定於第五十一條、第五十三條、第五十四條及第五十七條。本條規定廠商未依機關之通知辦理，視同放棄，以資明確，並杜爭議，有利審標、決標程序之進行。」機關依採購法第51條、第53條、第54條及第57條規定通知廠商到場說明、減價、比減價格、協商、更改原報內容或重新報價，縱招標文件已預先載明開標時間、地點，及廠商未於開標時間到場以備辦理採購法第51條、第53條、第54條或第57條規定作業者，視同放棄之文字，而機關於開標時遇有需依前開規定辦理之事項，對於該未到場之廠商，仍應先踐行通知程序（通知該廠商限期到場），該廠商未到場，始得依採購法第60條規定視同放棄。</w:t>
+        <w:t>二、按政府採購法（下稱採購法）第60條之立法說明：「審標、決標之過程，可能需要通知廠商辦理之事項，已分別規定於第五十一條、第五十三條、第五十四條及第五十七條。本條規定廠商未依機關之通知辦理，視同放棄，以資明確，並杜爭議，有利審標、決標程序之進行。」機關依採購法第51條、第53條、第54條及第57條規定通知廠商到場說明、減價、比減價格、協商、更改原報內容或重新報價，縱招標文件已預先載明開標時間、地點，及廠商未於開標時間到場以備辦理採購法第51條、第53條、第54條或第57條規定作業者，視同放棄之文字，而機關於開標時遇有需依前開規定辦理之事項，對於該未到場之廠商，仍應先踐行通知程序（通知該廠商限期到場），該廠商未到場，始得依採購法第60條規定視同放棄。</w:t>
       </w:r>
     </w:p>
     <w:p>
@@ -6471,22 +6471,7 @@
           <w:b w:val="0"/>
           <w:sz w:val="24"/>
         </w:rPr>
-        <w:t>二、按政府採購法（下稱採購法）第60條之立法</w:t>
-      </w:r>
-    </w:p>
-    <w:p>
-      <w:pPr>
-        <w:pStyle w:val="a9"/>
-        <w:ind w:left="720" w:hanging="720"/>
-        <w:jc w:val="both"/>
-      </w:pPr>
-      <w:r>
-        <w:rPr>
-          <w:rFonts w:ascii="新細明體" w:hAnsi="新細明體" w:eastAsia="新細明體"/>
-          <w:b w:val="0"/>
-          <w:sz w:val="24"/>
-        </w:rPr>
-        <w:t>說明：「審標、決標之過程，可能需要通知廠商辦理之事項，已分別規定於第五十一條、第五十三條、第五十四條及第五十七條。本條規定廠商未依機關之通知辦理，視同放棄，以資明確，並杜爭議，有利審標、決標程序之進行。」機關依採購法第51條、第53條、第54條及第57條規定通知廠商到場說明、減價、比減價格、協商、更改原報內容或重新報價，縱招標文件已預先載明開標時間、地點，及廠商未於開標時間到場以備辦理採購法第51條、第53條、第54條或第57條規定作業者，視同放棄之文字，而機關於開標時遇有需依前開規定辦理之事項，對於該未到場之廠商，仍應先踐行通知程序（通知該廠商限期到場），該廠商未到場，始得依採購法第60條規定視同放棄。</w:t>
+        <w:t>二、按政府採購法（下稱採購法）第60條之立法說明：「審標、決標之過程，可能需要通知廠商辦理之事項，已分別規定於第五十一條、第五十三條、第五十四條及第五十七條。本條規定廠商未依機關之通知辦理，視同放棄，以資明確，並杜爭議，有利審標、決標程序之進行。」機關依採購法第51條、第53條、第54條及第57條規定通知廠商到場說明、減價、比減價格、協商、更改原報內容或重新報價，縱招標文件已預先載明開標時間、地點，及廠商未於開標時間到場以備辦理採購法第51條、第53條、第54條或第57條規定作業者，視同放棄之文字，而機關於開標時遇有需依前開規定辦理之事項，對於該未到場之廠商，仍應先踐行通知程序（通知該廠商限期到場），該廠商未到場，始得依採購法第60條規定視同放棄。</w:t>
       </w:r>
     </w:p>
     <w:p>
@@ -6577,22 +6562,7 @@
           <w:b w:val="0"/>
           <w:sz w:val="24"/>
         </w:rPr>
-        <w:t>二、按政府採購法（下稱採購法）第60條規定：「機關辦理採購依第五十一條、第五十三條、第五十四條或第五十七條規定，通知廠商說明、減價、比減價格、協商、更改原報內容或重新報價，廠商未依通知期限辦理者，視同放棄。」查其立法</w:t>
-      </w:r>
-    </w:p>
-    <w:p>
-      <w:pPr>
-        <w:pStyle w:val="a9"/>
-        <w:ind w:left="720" w:hanging="720"/>
-        <w:jc w:val="both"/>
-      </w:pPr>
-      <w:r>
-        <w:rPr>
-          <w:rFonts w:ascii="新細明體" w:hAnsi="新細明體" w:eastAsia="新細明體"/>
-          <w:b w:val="0"/>
-          <w:sz w:val="24"/>
-        </w:rPr>
-        <w:t>說明：「審標、決標之過程，可能需要通知廠商辦理之事項，已分別規定於第五十一條、第五十三條、第五十四條及第五十七條。本條規定廠商未依機關之通知辦理，視同放棄，以資明確，並杜爭議，有利審標、決標程序之進行。」機關依採購法第51條、第53條、第54條及第57條規定通知廠商到場說明、減價、比減價格、協商、更改原報內容或重新報價，縱招標文件已預先載明開標時間、地點，及廠商未於開標時間到場以備辦理採購法第51條、第53條、第54條或第57條規定作業者，視同放棄之文字，而機關於開標時遇有需依前開規定辦理之事項，對於該未到場之廠商，仍應先踐行通知程序（通知該廠商限期到場），該廠商未到場，始得依採購法第60條規定視同放棄。</w:t>
+        <w:t>二、按政府採購法（下稱採購法）第60條規定：「機關辦理採購依第五十一條、第五十三條、第五十四條或第五十七條規定，通知廠商說明、減價、比減價格、協商、更改原報內容或重新報價，廠商未依通知期限辦理者，視同放棄。」查其立法說明：「審標、決標之過程，可能需要通知廠商辦理之事項，已分別規定於第五十一條、第五十三條、第五十四條及第五十七條。本條規定廠商未依機關之通知辦理，視同放棄，以資明確，並杜爭議，有利審標、決標程序之進行。」機關依採購法第51條、第53條、第54條及第57條規定通知廠商到場說明、減價、比減價格、協商、更改原報內容或重新報價，縱招標文件已預先載明開標時間、地點，及廠商未於開標時間到場以備辦理採購法第51條、第53條、第54條或第57條規定作業者，視同放棄之文字，而機關於開標時遇有需依前開規定辦理之事項，對於該未到場之廠商，仍應先踐行通知程序（通知該廠商限期到場），該廠商未到場，始得依採購法第60條規定視同放棄。</w:t>
       </w:r>
     </w:p>
     <w:p>
@@ -6811,31 +6781,16 @@
     <w:p>
       <w:pPr>
         <w:pStyle w:val="a9"/>
-        <w:ind w:left="960" w:hanging="960"/>
-        <w:jc w:val="both"/>
-      </w:pPr>
-      <w:r>
-        <w:rPr>
-          <w:rFonts w:ascii="新細明體" w:hAnsi="新細明體" w:eastAsia="新細明體"/>
-          <w:b w:val="0"/>
-          <w:sz w:val="24"/>
-        </w:rPr>
-        <w:t>備註：1. 「註」：依本會九十一年九月二十五日（九一）工程企字第〇九一〇〇四〇一九五〇號令修正公布之「中央機關未達公告金額採購招標辦法」，本函說明二所述「第二條第一款」修正為「第二條第一項第一款」，「第二條第二款或第三款」修正為「第二條第一項第二款或第三款」。</w:t>
-      </w:r>
-    </w:p>
-    <w:p>
-      <w:pPr>
-        <w:pStyle w:val="a9"/>
-        <w:ind w:left="960" w:hanging="240"/>
-        <w:jc w:val="both"/>
-      </w:pPr>
-      <w:r>
-        <w:rPr>
-          <w:rFonts w:ascii="新細明體" w:hAnsi="新細明體" w:eastAsia="新細明體"/>
-          <w:b w:val="0"/>
-          <w:sz w:val="24"/>
-        </w:rPr>
-        <w:t>2. 「註」：依本會九十一年九月二十五日（九一）工程企字第○九一○○四○一九五○號令修正公布之「中央機關未達公告金額採購招標辦法」，本函說明二所述「第二條第一款」修正為「第二條第一項第一款」，「第二條第二款或第三款」修正為「第二條第一項第二款」。</w:t>
+        <w:ind w:left="720" w:hanging="720"/>
+        <w:jc w:val="both"/>
+      </w:pPr>
+      <w:r>
+        <w:rPr>
+          <w:rFonts w:ascii="新細明體" w:hAnsi="新細明體" w:eastAsia="新細明體"/>
+          <w:b w:val="0"/>
+          <w:sz w:val="24"/>
+        </w:rPr>
+        <w:t>備註：1. 依本會九十一年九月二十五日（九一）工程企字第〇九一〇〇四〇一九五〇號令修正公布之「中央機關未達公告金額採購招標辦法」，本函說明二所述「第二條第一款」修正為「第二條第一項第一款」，「第二條第二款或第三款」修正為「第二條第一項第二款或第三款」。</w:t>
       </w:r>
     </w:p>
     <w:p/>
@@ -6926,7 +6881,7 @@
           <w:b w:val="0"/>
           <w:sz w:val="24"/>
         </w:rPr>
-        <w:t>3. 「採購評選委員會審議規則」本會於九十二年六月二十五日工程企字第0九二00二五四二00號令修正發布,第九條第一項已修正為出席委員中之外聘專家、學者人數，不得少於出席委員人數之三分之一。</w:t>
+        <w:t>3. 「採購評選委員會審議規則」本會於九十二年六月二十五日工程企字第〇九二〇〇二五四二〇〇號令修正發布，第九條第一項已修正為出席委員中之外聘專家、學者人數，不得少於出席委員人數之三分之一。</w:t>
       </w:r>
     </w:p>
     <w:p/>
@@ -7205,16 +7160,31 @@
     <w:p>
       <w:pPr>
         <w:pStyle w:val="a9"/>
-        <w:ind w:left="720" w:hanging="720"/>
-        <w:jc w:val="both"/>
-      </w:pPr>
-      <w:r>
-        <w:rPr>
-          <w:rFonts w:ascii="新細明體" w:hAnsi="新細明體" w:eastAsia="新細明體"/>
-          <w:b w:val="0"/>
-          <w:sz w:val="24"/>
-        </w:rPr>
-        <w:t>備註：1. 一、行政院93年9月30日院授主忠字第0930006127號函將「統一彙整修政各機關學校出席費及稿費支給要點」修正為「各機關學校出席費及稿費支給要點」。二、行政院104年7月15日院授主預字第1040101385A號函將「各機關學校出席費及稿費支給要點」修正為「中央政府各機關學校出席費及稿費支給要點」。</w:t>
+        <w:ind w:left="960" w:hanging="960"/>
+        <w:jc w:val="both"/>
+      </w:pPr>
+      <w:r>
+        <w:rPr>
+          <w:rFonts w:ascii="新細明體" w:hAnsi="新細明體" w:eastAsia="新細明體"/>
+          <w:b w:val="0"/>
+          <w:sz w:val="24"/>
+        </w:rPr>
+        <w:t>備註：1. 行政院93年9月30日院授主忠字第0930006127號函將「統一彙整修政各機關學校出席費及稿費支給要點」修正為「各機關學校出席費及稿費支給要點」。</w:t>
+      </w:r>
+    </w:p>
+    <w:p>
+      <w:pPr>
+        <w:pStyle w:val="a9"/>
+        <w:ind w:left="960" w:hanging="240"/>
+        <w:jc w:val="both"/>
+      </w:pPr>
+      <w:r>
+        <w:rPr>
+          <w:rFonts w:ascii="新細明體" w:hAnsi="新細明體" w:eastAsia="新細明體"/>
+          <w:b w:val="0"/>
+          <w:sz w:val="24"/>
+        </w:rPr>
+        <w:t>2. 行政院104年7月15日院授主預字第1040101385A號函將「各機關學校出席費及稿費支給要點」修正為「中央政府各機關學校出席費及稿費支給要點」。</w:t>
       </w:r>
     </w:p>
     <w:p/>
@@ -7448,16 +7418,31 @@
     <w:p>
       <w:pPr>
         <w:pStyle w:val="a9"/>
-        <w:ind w:left="720" w:hanging="720"/>
-        <w:jc w:val="both"/>
-      </w:pPr>
-      <w:r>
-        <w:rPr>
-          <w:rFonts w:ascii="新細明體" w:hAnsi="新細明體" w:eastAsia="新細明體"/>
-          <w:b w:val="0"/>
-          <w:sz w:val="24"/>
-        </w:rPr>
-        <w:t>備註：1. 一、本函附件採購評選程序精進措施作業階段一、(七)、1所述「各機關學校出席費及稿費支給要點」業經行政院104年7月15日院授主預字第1040101385A號函修正為「中央政府各機關學校出席費及稿費支給要點」；其支給外聘評選委員出席費，行政院106年12月27日院授主預字第1060103113號函修正公布「中央政府各機關學校出席費及稿費支給要點」；已有修正。二、本函附件採購評選程序精進措施作業階段一、(七)、3所述外聘評選委員審查費，行政院104年7月15日院授主預字第1040101385A號函修正公布「中央政府各機關學校出席費及稿費支給要點」已有修正。</w:t>
+        <w:ind w:left="960" w:hanging="960"/>
+        <w:jc w:val="both"/>
+      </w:pPr>
+      <w:r>
+        <w:rPr>
+          <w:rFonts w:ascii="新細明體" w:hAnsi="新細明體" w:eastAsia="新細明體"/>
+          <w:b w:val="0"/>
+          <w:sz w:val="24"/>
+        </w:rPr>
+        <w:t>備註：1. 本函附件採購評選程序精進措施作業階段一、(七)、1所述「各機關學校出席費及稿費支給要點」業經行政院104年7月15日院授主預字第1040101385A號函修正為「中央政府各機關學校出席費及稿費支給要點」；其支給外聘評選委員出席費，行政院106年12月27日院授主預字第1060103113號函修正公布「中央政府各機關學校出席費及稿費支給要點」；已有修正。</w:t>
+      </w:r>
+    </w:p>
+    <w:p>
+      <w:pPr>
+        <w:pStyle w:val="a9"/>
+        <w:ind w:left="960" w:hanging="240"/>
+        <w:jc w:val="both"/>
+      </w:pPr>
+      <w:r>
+        <w:rPr>
+          <w:rFonts w:ascii="新細明體" w:hAnsi="新細明體" w:eastAsia="新細明體"/>
+          <w:b w:val="0"/>
+          <w:sz w:val="24"/>
+        </w:rPr>
+        <w:t>2. 本函附件採購評選程序精進措施作業階段一、(七)、3所述外聘評選委員審查費，行政院104年7月15日院授主預字第1040101385A號函修正公布「中央政府各機關學校出席費及稿費支給要點」已有修正。</w:t>
       </w:r>
     </w:p>
     <w:p/>
@@ -7549,67 +7534,7 @@
           <w:b w:val="0"/>
           <w:sz w:val="24"/>
         </w:rPr>
-        <w:t>一、按審議規則第6條規定：「……不同委員之評選結果有明顯差異時，召集人應提交本委員會議決或依本委員會決議辦理複評。複評結果仍有明顯差異時，由本委員會決議之（第2項）。本委員會依前項規定，得作成下列議決或決議：</w:t>
-      </w:r>
-    </w:p>
-    <w:p>
-      <w:pPr>
-        <w:pStyle w:val="a9"/>
-        <w:ind w:left="720" w:hanging="480"/>
-        <w:jc w:val="both"/>
-      </w:pPr>
-      <w:r>
-        <w:rPr>
-          <w:rFonts w:ascii="新細明體" w:hAnsi="新細明體" w:eastAsia="新細明體"/>
-          <w:b w:val="0"/>
-          <w:sz w:val="24"/>
-        </w:rPr>
-        <w:t>一、維持原評選結果。</w:t>
-      </w:r>
-    </w:p>
-    <w:p>
-      <w:pPr>
-        <w:pStyle w:val="a9"/>
-        <w:ind w:left="720" w:hanging="480"/>
-        <w:jc w:val="both"/>
-      </w:pPr>
-      <w:r>
-        <w:rPr>
-          <w:rFonts w:ascii="新細明體" w:hAnsi="新細明體" w:eastAsia="新細明體"/>
-          <w:b w:val="0"/>
-          <w:sz w:val="24"/>
-        </w:rPr>
-        <w:t>二、除去個別委員評選結果，重計評選結果。</w:t>
-      </w:r>
-    </w:p>
-    <w:p>
-      <w:pPr>
-        <w:pStyle w:val="a9"/>
-        <w:ind w:left="720" w:hanging="480"/>
-        <w:jc w:val="both"/>
-      </w:pPr>
-      <w:r>
-        <w:rPr>
-          <w:rFonts w:ascii="新細明體" w:hAnsi="新細明體" w:eastAsia="新細明體"/>
-          <w:b w:val="0"/>
-          <w:sz w:val="24"/>
-        </w:rPr>
-        <w:t>三、廢棄原評選結果，重行提出評選結果。</w:t>
-      </w:r>
-    </w:p>
-    <w:p>
-      <w:pPr>
-        <w:pStyle w:val="a9"/>
-        <w:ind w:left="720" w:hanging="480"/>
-        <w:jc w:val="both"/>
-      </w:pPr>
-      <w:r>
-        <w:rPr>
-          <w:rFonts w:ascii="新細明體" w:hAnsi="新細明體" w:eastAsia="新細明體"/>
-          <w:b w:val="0"/>
-          <w:sz w:val="24"/>
-        </w:rPr>
-        <w:t>四、無法評定最有利標（第3項）。」機關辦理採購評選作業，如有不同委員之評選結果有明顯差異，應依審議規則第6條規定辦理，不得僅憑召集人詢問各出席委員主觀意見即認定無明顯差異情形。工作小組可協助向召集人說明明顯差異情形，並請召集人依規定辦理。本會訂定「最有利標作業手冊」肆、五、（十三）列舉評選結果有明顯差異之態樣，併請查察（公開於本會網站）。</w:t>
+        <w:t>一、按審議規則第6條規定：「……不同委員之評選結果有明顯差異時，召集人應提交本委員會議決或依本委員會決議辦理複評。複評結果仍有明顯差異時，由本委員會決議之（第2項）。本委員會依前項規定，得作成下列議決或決議：一、維持原評選結果。二、除去個別委員評選結果，重計評選結果。三、廢棄原評選結果，重行提出評選結果。四、無法評定最有利標（第3項）。」機關辦理採購評選作業，如有不同委員之評選結果有明顯差異，應依審議規則第6條規定辦理，不得僅憑召集人詢問各出席委員主觀意見即認定無明顯差異情形。工作小組可協助向召集人說明明顯差異情形，並請召集人依規定辦理。本會訂定「最有利標作業手冊」肆、五、（十三）列舉評選結果有明顯差異之態樣，併請查察（公開於本會網站）。</w:t>
       </w:r>
     </w:p>
     <w:p>
@@ -7790,97 +7715,7 @@
           <w:b w:val="0"/>
           <w:sz w:val="24"/>
         </w:rPr>
-        <w:t>（二）支給要點第4點規定：「有下列情形之一者，不得支給出席費：</w:t>
-      </w:r>
-    </w:p>
-    <w:p>
-      <w:pPr>
-        <w:pStyle w:val="a9"/>
-        <w:ind w:left="964" w:hanging="680"/>
-        <w:jc w:val="both"/>
-      </w:pPr>
-      <w:r>
-        <w:rPr>
-          <w:rFonts w:ascii="新細明體" w:hAnsi="新細明體" w:eastAsia="新細明體"/>
-          <w:b w:val="0"/>
-          <w:sz w:val="24"/>
-        </w:rPr>
-        <w:t>（一）由本機關學校人員(含任務編組)或應邀機關學校指派代表出席會議。</w:t>
-      </w:r>
-    </w:p>
-    <w:p>
-      <w:pPr>
-        <w:pStyle w:val="a9"/>
-        <w:ind w:left="964" w:hanging="680"/>
-        <w:jc w:val="both"/>
-      </w:pPr>
-      <w:r>
-        <w:rPr>
-          <w:rFonts w:ascii="新細明體" w:hAnsi="新細明體" w:eastAsia="新細明體"/>
-          <w:b w:val="0"/>
-          <w:sz w:val="24"/>
-        </w:rPr>
-        <w:t>（二）各機關學校召開之會議屬一般經常性業務會議。</w:t>
-      </w:r>
-    </w:p>
-    <w:p>
-      <w:pPr>
-        <w:pStyle w:val="a9"/>
-        <w:ind w:left="964" w:hanging="680"/>
-        <w:jc w:val="both"/>
-      </w:pPr>
-      <w:r>
-        <w:rPr>
-          <w:rFonts w:ascii="新細明體" w:hAnsi="新細明體" w:eastAsia="新細明體"/>
-          <w:b w:val="0"/>
-          <w:sz w:val="24"/>
-        </w:rPr>
-        <w:t>（三）因故未能成會。</w:t>
-      </w:r>
-    </w:p>
-    <w:p>
-      <w:pPr>
-        <w:pStyle w:val="a9"/>
-        <w:ind w:left="964" w:hanging="680"/>
-        <w:jc w:val="both"/>
-      </w:pPr>
-      <w:r>
-        <w:rPr>
-          <w:rFonts w:ascii="新細明體" w:hAnsi="新細明體" w:eastAsia="新細明體"/>
-          <w:b w:val="0"/>
-          <w:sz w:val="24"/>
-        </w:rPr>
-        <w:t>（四）未親自出席，而以書面、錄音或錄影等方式提供意見。</w:t>
-      </w:r>
-    </w:p>
-    <w:p>
-      <w:pPr>
-        <w:pStyle w:val="a9"/>
-        <w:ind w:left="964" w:hanging="680"/>
-        <w:jc w:val="both"/>
-      </w:pPr>
-      <w:r>
-        <w:rPr>
-          <w:rFonts w:ascii="新細明體" w:hAnsi="新細明體" w:eastAsia="新細明體"/>
-          <w:b w:val="0"/>
-          <w:sz w:val="24"/>
-        </w:rPr>
-        <w:t>（五）各機關學校人員出席其補助計畫、委辦計畫或受補助計畫之相關會議。</w:t>
-      </w:r>
-    </w:p>
-    <w:p>
-      <w:pPr>
-        <w:pStyle w:val="a9"/>
-        <w:ind w:left="964" w:hanging="680"/>
-        <w:jc w:val="both"/>
-      </w:pPr>
-      <w:r>
-        <w:rPr>
-          <w:rFonts w:ascii="新細明體" w:hAnsi="新細明體" w:eastAsia="新細明體"/>
-          <w:b w:val="0"/>
-          <w:sz w:val="24"/>
-        </w:rPr>
-        <w:t>（六）受委辦機關學校人員，已於委辦計畫內依參與事項分工列支主持費及研究費等酬勞。」</w:t>
+        <w:t>（二）支給要點第4點規定：「有下列情形之一者，不得支給出席費：（一）由本機關學校人員(含任務編組)或應邀機關學校指派代表出席會議。（二）各機關學校召開之會議屬一般經常性業務會議。（三）因故未能成會。（四）未親自出席，而以書面、錄音或錄影等方式提供意見。（五）各機關學校人員出席其補助計畫、委辦計畫或受補助計畫之相關會議。（六）受委辦機關學校人員，已於委辦計畫內依參與事項分工列支主持費及研究費等酬勞。」</w:t>
       </w:r>
     </w:p>
     <w:p>
@@ -7986,7 +7821,52 @@
           <w:b w:val="0"/>
           <w:sz w:val="24"/>
         </w:rPr>
-        <w:t>主旨：有關個案採購評選委員以視訊方式出席評選會議之執行方式，詳如說明，請查照。說明：一、為因應2019新型冠狀病毒肺炎(COVID-19)疫情，啟動異地辦公，致使委員無法身處同一辦公場所出席採購案之評選委員會，如評選委員以「視訊」方式與會（含主持、出席、參與會議），尚無不可。採購評選委員會審議規則（下稱審議規則）第7條第1項規定，併請查察。二、另按審議規則第6條之1第1項及第2項規定：「委員辦理評選，應於機關備具之評分 (比) 表逐項載明各受評廠商之評分或序位，並簽名或蓋章（第1項）。機關於委員評選後，應彙整製作總表，載明下列事項，由參與評選全體委員簽名或蓋章。其內容有修正者，應經修正人員簽名或蓋章：......（第2項）」；第9條規定：「本委員會會議，應有委員總額二分之一以上出席，其決議應經出席委員過半數之同意行之。出席委員中之專家、學者人數應至少二人且不得少於出席人數之三分之一（第1項）。......第一項會議，應作成紀錄，由出席委員全體簽名（第4項）。」評選委員如以「視訊」方式與會，其於上開文件之簽名或蓋章，得以傳真或電子數位檔（照相或掃描）方式為之，並回傳予機關，由機關將該傳真或電子數位檔列印文件併附於總表及會議紀錄。</w:t>
+        <w:t>主旨：有關個案採購評選委員以視訊方式出席評選會議之執行方式，詳如說明，請查照。</w:t>
+      </w:r>
+    </w:p>
+    <w:p>
+      <w:pPr>
+        <w:pStyle w:val="a9"/>
+        <w:ind w:left="720" w:hanging="720"/>
+        <w:jc w:val="both"/>
+      </w:pPr>
+      <w:r>
+        <w:rPr>
+          <w:rFonts w:ascii="新細明體" w:hAnsi="新細明體" w:eastAsia="新細明體"/>
+          <w:b w:val="0"/>
+          <w:sz w:val="24"/>
+        </w:rPr>
+        <w:t>說明：</w:t>
+      </w:r>
+    </w:p>
+    <w:p>
+      <w:pPr>
+        <w:pStyle w:val="a9"/>
+        <w:ind w:left="720" w:hanging="480"/>
+        <w:jc w:val="both"/>
+      </w:pPr>
+      <w:r>
+        <w:rPr>
+          <w:rFonts w:ascii="新細明體" w:hAnsi="新細明體" w:eastAsia="新細明體"/>
+          <w:b w:val="0"/>
+          <w:sz w:val="24"/>
+        </w:rPr>
+        <w:t>一、為因應2019新型冠狀病毒肺炎(COVID-19)疫情，啟動異地辦公，致使委員無法身處同一辦公場所出席採購案之評選委員會，如評選委員以「視訊」方式與會（含主持、出席、參與會議），尚無不可。採購評選委員會審議規則（下稱審議規則）第7條第1項規定，併請查察。</w:t>
+      </w:r>
+    </w:p>
+    <w:p>
+      <w:pPr>
+        <w:pStyle w:val="a9"/>
+        <w:ind w:left="720" w:hanging="480"/>
+        <w:jc w:val="both"/>
+      </w:pPr>
+      <w:r>
+        <w:rPr>
+          <w:rFonts w:ascii="新細明體" w:hAnsi="新細明體" w:eastAsia="新細明體"/>
+          <w:b w:val="0"/>
+          <w:sz w:val="24"/>
+        </w:rPr>
+        <w:t>二、另按審議規則第6條之1第1項及第2項規定：「委員辦理評選，應於機關備具之評分 (比) 表逐項載明各受評廠商之評分或序位，並簽名或蓋章（第1項）。機關於委員評選後，應彙整製作總表，載明下列事項，由參與評選全體委員簽名或蓋章。其內容有修正者，應經修正人員簽名或蓋章：......（第2項）」；第9條規定：「本委員會會議，應有委員總額二分之一以上出席，其決議應經出席委員過半數之同意行之。出席委員中之專家、學者人數應至少二人且不得少於出席人數之三分之一（第1項）。......第一項會議，應作成紀錄，由出席委員全體簽名（第4項）。」評選委員如以「視訊」方式與會，其於上開文件之簽名或蓋章，得以傳真或電子數位檔（照相或掃描）方式為之，並回傳予機關，由機關將該傳真或電子數位檔列印文件併附於總表及會議紀錄。</w:t>
       </w:r>
     </w:p>
     <w:p/>
@@ -8168,7 +8048,52 @@
           <w:b w:val="0"/>
           <w:sz w:val="24"/>
         </w:rPr>
-        <w:t>主旨：關於投標廠商是否得以視訊方式出席採購評選委員會議並進行簡報詢答之疑義，復如說明，請查照。說明：一、復貴部110年5月20日文秘字第1103013603號函。二、所詢疑義，關於來函所述因應2019新型冠狀病毒肺炎（COVID-19)，基於整體防疫需要及業務推動考量，機關召開採購評選會議，投標廠商以「視訊」方式辦理簡報及詢答，皆無不可。本會109年5月1日工程企字第1090008229號函，併請參閱（公開於本會網站）。</w:t>
+        <w:t>主旨：關於投標廠商是否得以視訊方式出席採購評選委員會議並進行簡報詢答之疑義，復如說明，請查照。</w:t>
+      </w:r>
+    </w:p>
+    <w:p>
+      <w:pPr>
+        <w:pStyle w:val="a9"/>
+        <w:ind w:left="720" w:hanging="720"/>
+        <w:jc w:val="both"/>
+      </w:pPr>
+      <w:r>
+        <w:rPr>
+          <w:rFonts w:ascii="新細明體" w:hAnsi="新細明體" w:eastAsia="新細明體"/>
+          <w:b w:val="0"/>
+          <w:sz w:val="24"/>
+        </w:rPr>
+        <w:t>說明：</w:t>
+      </w:r>
+    </w:p>
+    <w:p>
+      <w:pPr>
+        <w:pStyle w:val="a9"/>
+        <w:ind w:left="720" w:hanging="480"/>
+        <w:jc w:val="both"/>
+      </w:pPr>
+      <w:r>
+        <w:rPr>
+          <w:rFonts w:ascii="新細明體" w:hAnsi="新細明體" w:eastAsia="新細明體"/>
+          <w:b w:val="0"/>
+          <w:sz w:val="24"/>
+        </w:rPr>
+        <w:t>一、復貴部110年5月20日文秘字第1103013603號函。</w:t>
+      </w:r>
+    </w:p>
+    <w:p>
+      <w:pPr>
+        <w:pStyle w:val="a9"/>
+        <w:ind w:left="720" w:hanging="480"/>
+        <w:jc w:val="both"/>
+      </w:pPr>
+      <w:r>
+        <w:rPr>
+          <w:rFonts w:ascii="新細明體" w:hAnsi="新細明體" w:eastAsia="新細明體"/>
+          <w:b w:val="0"/>
+          <w:sz w:val="24"/>
+        </w:rPr>
+        <w:t>二、所詢疑義，關於來函所述因應2019新型冠狀病毒肺炎（COVID-19)，基於整體防疫需要及業務推動考量，機關召開採購評選會議，投標廠商以「視訊」方式辦理簡報及詢答，皆無不可。本會109年5月1日工程企字第1090008229號函，併請參閱（公開於本會網站）。</w:t>
       </w:r>
     </w:p>
     <w:p/>
@@ -8199,7 +8124,52 @@
           <w:b w:val="0"/>
           <w:sz w:val="24"/>
         </w:rPr>
-        <w:t>主旨：檢送本會訂定「評選會議採視訊方式參考作業流程」乙份，請查照並轉知所屬機關。說明：一、為因應嚴重特殊傳染性肺炎（COVID-19），落實各項防疫措施，降低人員移動或接觸之風險，爰訂定旨揭參考作業流程，供各機關參考使用。二、本會109年4月27日工程企字第1090008271號函、109年5月1日工程企字第1090008229號函、110年5月28日工程企字第1100012304號函及110年6月22日工程企字第1100100714號函（公開於本會網站），併請參考。</w:t>
+        <w:t>主旨：檢送本會訂定「評選會議採視訊方式參考作業流程」乙份，請查照並轉知所屬機關。</w:t>
+      </w:r>
+    </w:p>
+    <w:p>
+      <w:pPr>
+        <w:pStyle w:val="a9"/>
+        <w:ind w:left="720" w:hanging="720"/>
+        <w:jc w:val="both"/>
+      </w:pPr>
+      <w:r>
+        <w:rPr>
+          <w:rFonts w:ascii="新細明體" w:hAnsi="新細明體" w:eastAsia="新細明體"/>
+          <w:b w:val="0"/>
+          <w:sz w:val="24"/>
+        </w:rPr>
+        <w:t>說明：</w:t>
+      </w:r>
+    </w:p>
+    <w:p>
+      <w:pPr>
+        <w:pStyle w:val="a9"/>
+        <w:ind w:left="720" w:hanging="480"/>
+        <w:jc w:val="both"/>
+      </w:pPr>
+      <w:r>
+        <w:rPr>
+          <w:rFonts w:ascii="新細明體" w:hAnsi="新細明體" w:eastAsia="新細明體"/>
+          <w:b w:val="0"/>
+          <w:sz w:val="24"/>
+        </w:rPr>
+        <w:t>一、為因應嚴重特殊傳染性肺炎（COVID-19)，落實各項防疫措施，降低人員移動或接觸之風險，爰訂定旨揭參考作業流程，供各機關參考使用。</w:t>
+      </w:r>
+    </w:p>
+    <w:p>
+      <w:pPr>
+        <w:pStyle w:val="a9"/>
+        <w:ind w:left="720" w:hanging="480"/>
+        <w:jc w:val="both"/>
+      </w:pPr>
+      <w:r>
+        <w:rPr>
+          <w:rFonts w:ascii="新細明體" w:hAnsi="新細明體" w:eastAsia="新細明體"/>
+          <w:b w:val="0"/>
+          <w:sz w:val="24"/>
+        </w:rPr>
+        <w:t>二、本會109年4月27日工程企字第1090008271號函、109年5月1日工程企字第1090008229號函、110年5月28日工程企字第1100012304號函及110年6月22日工程企字第1100100714號函（公開於本會網站），併請參考。</w:t>
       </w:r>
     </w:p>
     <w:p/>
@@ -8230,7 +8200,142 @@
           <w:b w:val="0"/>
           <w:sz w:val="24"/>
         </w:rPr>
-        <w:t>主旨：有關以網路視訊方式辦理評選會議之執行疑義，復如說明，請查照。說明：一、復貴府110年6月22日府授工採字第1100124685號函及同年月23日電子郵件補充說明。二、來函說明三，說明如下：(一)所詢疑義，關於「採線上數位簽名或電子簽章等模式」乙節，視訊與會之評選委員於相關文件（會議紀錄及評選總表）之簽名或蓋章，得以傳真或電子數位檔（照相或掃描）方式為之，係指簽名文件之傳送方式，惟簽名或蓋章仍須符合親自簽名或法定之要件。又按簽名係於「文書」親署姓名，以為憑信之謂(最高法院71年台上字第4416號民事判決參照)，爰評選委員自己簽名，仍應於該相關文件上為之，以確保該評選委員認同「評選總表」及「會議紀錄」內容。本會已以110年7月8日工程企字第1100100883號函訂定「評選會議採視訊方式參考作業流程」（含附件「評選總表簽名頁」及「會議紀錄簽名頁」，公開於本會網站），機關辦理評選作業，得於會前先行寄送評選委員上開簽名頁，供委員簽名或蓋章後，回傳予機關。(二)另委員將上開簽名或蓋章之文件，以傳真或電子數位檔（照相或掃描）方式回傳予機關，由機關將該傳真或電子數位檔列印文件併附於總表及會議紀錄，委員無須再寄紙本簽名文件予機關。三、來函說明四，說明如下：(一)採購評選委員會審議規則（下稱審議規則）第6條之1第3項：「前項第四款，各受評廠商之評分或序位評比結果，其所標示之各出席委員姓名，得以代號代之。」上開規定，係指機關製作評選總表，其各受評廠商之評分或序位評比結果「所標示之各出席委員姓名」，得以代號代之。前揭規定並非保密規定，爰縱使委員個人評分（比）表之代號與委員姓名之連結無法隱蔽，亦無涉違反審議規則第6條之1第3項之規定。(二)審議規則第7條第1項：「工作小組擬具初審意見及本委員會審查、議決等評選作業，以記名方式秘密為之為原則。」最有利標評選辦法第20條第3項：「各出席委員之評分或序位評比表，除法令另有規定外，應保守秘密，不得申請閱覽、抄寫、複印或攝影。」上開規定係指評選作業或各出席委員之評分或序位評比表，應秘密為之或保守秘密。爰如機關辦理評選作業，知悉上開事項之人員依法皆應遵守保密相關規定（不以來函所述「要求個案評選會之相關人員切結保密」為要件），即無違反審議規則第7條第1項及最有利標評選辦法第20條第3項之虞。四、來函說明五，關於來函所述「工作小組如以通訊軟體（如LINE）、雲端空間（如GOOGLE雲端硬碟）或其他可供下載檔案之方式提供評選委員初審意見」乙節，據洽貴府以電子郵件補充說明，係「擔心相關軟體資安防護或許不是100%周全，多多少少都有資訊洩漏的疑慮」。所詢疑義，政府採購法尚無規定機關將工作小組初審意見（或廠商投標文件）於評選前先行提供評選委員之方式，爰機關以「通訊軟體（如LINE）、雲端空間（如GOOGLE雲端硬碟）」提供委員初審意見，如確能執行相關保密作業（例如將初審意見檔案另行以加密方式處理，且以其他方式告知委員解密方式），尚無違反審議規則第7條第1項規定。</w:t>
+        <w:t>主旨：有關以網路視訊方式辦理評選會議之執行疑義，復如說明，請查照。</w:t>
+      </w:r>
+    </w:p>
+    <w:p>
+      <w:pPr>
+        <w:pStyle w:val="a9"/>
+        <w:ind w:left="720" w:hanging="720"/>
+        <w:jc w:val="both"/>
+      </w:pPr>
+      <w:r>
+        <w:rPr>
+          <w:rFonts w:ascii="新細明體" w:hAnsi="新細明體" w:eastAsia="新細明體"/>
+          <w:b w:val="0"/>
+          <w:sz w:val="24"/>
+        </w:rPr>
+        <w:t>說明：</w:t>
+      </w:r>
+    </w:p>
+    <w:p>
+      <w:pPr>
+        <w:pStyle w:val="a9"/>
+        <w:ind w:left="720" w:hanging="480"/>
+        <w:jc w:val="both"/>
+      </w:pPr>
+      <w:r>
+        <w:rPr>
+          <w:rFonts w:ascii="新細明體" w:hAnsi="新細明體" w:eastAsia="新細明體"/>
+          <w:b w:val="0"/>
+          <w:sz w:val="24"/>
+        </w:rPr>
+        <w:t>一、復貴府110年6月22日府授工採字第1100124685號函及同年月23日電子郵件補充說明。</w:t>
+      </w:r>
+    </w:p>
+    <w:p>
+      <w:pPr>
+        <w:pStyle w:val="a9"/>
+        <w:ind w:left="720" w:hanging="480"/>
+        <w:jc w:val="both"/>
+      </w:pPr>
+      <w:r>
+        <w:rPr>
+          <w:rFonts w:ascii="新細明體" w:hAnsi="新細明體" w:eastAsia="新細明體"/>
+          <w:b w:val="0"/>
+          <w:sz w:val="24"/>
+        </w:rPr>
+        <w:t>二、來函說明三，說明如下：</w:t>
+      </w:r>
+    </w:p>
+    <w:p>
+      <w:pPr>
+        <w:pStyle w:val="a9"/>
+        <w:ind w:left="964" w:hanging="680"/>
+        <w:jc w:val="both"/>
+      </w:pPr>
+      <w:r>
+        <w:rPr>
+          <w:rFonts w:ascii="新細明體" w:hAnsi="新細明體" w:eastAsia="新細明體"/>
+          <w:b w:val="0"/>
+          <w:sz w:val="24"/>
+        </w:rPr>
+        <w:t>（一）所詢疑義，關於「採線上數位簽名或電子簽章等模式」乙節，視訊與會之評選委員於相關文件（會議紀錄及評選總表）之簽名或蓋章，得以傳真或電子數位檔（照相或掃描）方式為之，係指簽名文件之傳送方式，惟簽名或蓋章仍須符合親自簽名或法定之要件。又按簽名係於「文書」親署姓名，以為憑信之謂(最高法院71年台上字第4416號民事判決參照)，爰評選委員自己簽名，仍應於該相關文件上為之，以確保該評選委員認同「評選總表」及「會議紀錄」內容。本會已以110年7月8日工程企字第1100100883號函訂定「評選會議採視訊方式參考作業流程」（含附件「評選總表簽名頁」及「會議紀錄簽名頁」，公開於本會網站），機關辦理評選作業，得於會前先行寄送評選委員上開簽名頁，供委員簽名或蓋章後，回傳予機關。</w:t>
+      </w:r>
+    </w:p>
+    <w:p>
+      <w:pPr>
+        <w:pStyle w:val="a9"/>
+        <w:ind w:left="964" w:hanging="680"/>
+        <w:jc w:val="both"/>
+      </w:pPr>
+      <w:r>
+        <w:rPr>
+          <w:rFonts w:ascii="新細明體" w:hAnsi="新細明體" w:eastAsia="新細明體"/>
+          <w:b w:val="0"/>
+          <w:sz w:val="24"/>
+        </w:rPr>
+        <w:t>（二）另委員將上開簽名或蓋章之文件，以傳真或電子數位檔（照相或掃描）方式回傳予機關，由機關將該傳真或電子數位檔列印文件併附於總表及會議紀錄，委員無須再寄紙本簽名文件予機關。</w:t>
+      </w:r>
+    </w:p>
+    <w:p>
+      <w:pPr>
+        <w:pStyle w:val="a9"/>
+        <w:ind w:left="720" w:hanging="480"/>
+        <w:jc w:val="both"/>
+      </w:pPr>
+      <w:r>
+        <w:rPr>
+          <w:rFonts w:ascii="新細明體" w:hAnsi="新細明體" w:eastAsia="新細明體"/>
+          <w:b w:val="0"/>
+          <w:sz w:val="24"/>
+        </w:rPr>
+        <w:t>三、來函說明四，說明如下：</w:t>
+      </w:r>
+    </w:p>
+    <w:p>
+      <w:pPr>
+        <w:pStyle w:val="a9"/>
+        <w:ind w:left="964" w:hanging="680"/>
+        <w:jc w:val="both"/>
+      </w:pPr>
+      <w:r>
+        <w:rPr>
+          <w:rFonts w:ascii="新細明體" w:hAnsi="新細明體" w:eastAsia="新細明體"/>
+          <w:b w:val="0"/>
+          <w:sz w:val="24"/>
+        </w:rPr>
+        <w:t>（一）採購評選委員會審議規則（下稱審議規則）第6條之1第3項：「前項第四款，各受評廠商之評分或序位評比結果，其所標示之各出席委員姓名，得以代號代之。」上開規定，係指機關製作評選總表，其各受評廠商之評分或序位評比結果「所標示之各出席委員姓名」，得以代號代之。前揭規定並非保密規定，爰縱使委員個人評分（比）表之代號與委員姓名之連結無法隱蔽，亦無涉違反審議規則第6條之1第3項之規定。</w:t>
+      </w:r>
+    </w:p>
+    <w:p>
+      <w:pPr>
+        <w:pStyle w:val="a9"/>
+        <w:ind w:left="964" w:hanging="680"/>
+        <w:jc w:val="both"/>
+      </w:pPr>
+      <w:r>
+        <w:rPr>
+          <w:rFonts w:ascii="新細明體" w:hAnsi="新細明體" w:eastAsia="新細明體"/>
+          <w:b w:val="0"/>
+          <w:sz w:val="24"/>
+        </w:rPr>
+        <w:t>（二）審議規則第7條第1項：「工作小組擬具初審意見及本委員會審查、議決等評選作業，以記名方式秘密為之為原則。」最有利標評選辦法第20條第3項：「各出席委員之評分或序位評比表，除法令另有規定外，應保守秘密，不得申請閱覽、抄寫、複印或攝影。」上開規定係指評選作業或各出席委員之評分或序位評比表，應秘密為之或保守秘密。爰如機關辦理評選作業，知悉上開事項之人員依法皆應遵守保密相關規定（不以來函所述「要求個案評選會之相關人員切結保密」為要件），即無違反審議規則第7條第1項及最有利標評選辦法第20條第3項之虞。</w:t>
+      </w:r>
+    </w:p>
+    <w:p>
+      <w:pPr>
+        <w:pStyle w:val="a9"/>
+        <w:ind w:left="720" w:hanging="480"/>
+        <w:jc w:val="both"/>
+      </w:pPr>
+      <w:r>
+        <w:rPr>
+          <w:rFonts w:ascii="新細明體" w:hAnsi="新細明體" w:eastAsia="新細明體"/>
+          <w:b w:val="0"/>
+          <w:sz w:val="24"/>
+        </w:rPr>
+        <w:t>四、來函說明五，關於來函所述「工作小組如以通訊軟體（如LINE）、雲端空間（如GOOGLE雲端硬碟）或其他可供下載檔案之方式提供評選委員初審意見」乙節，據洽貴府以電子郵件補充說明，係「擔心相關軟體資安防護或許不是100%周全，多多少少都有資訊洩漏的疑慮」。所詢疑義，政府採購法尚無規定機關將工作小組初審意見（或廠商投標文件）於評選前先行提供評選委員之方式，爰機關以「通訊軟體（如LINE）、雲端空間（如GOOGLE雲端硬碟）」提供委員初審意見，如確能執行相關保密作業（例如將初審意見檔案另行以加密方式處理，且以其他方式告知委員解密方式），尚無違反審議規則第7條第1項規定。</w:t>
       </w:r>
     </w:p>
     <w:p/>
@@ -8261,7 +8366,52 @@
           <w:b w:val="0"/>
           <w:sz w:val="24"/>
         </w:rPr>
-        <w:t>主旨：有關採購評選委員會審議規則第14條規定之適用疑義，本會意見如說明，請查照。說明：一、復貴部110年8月4日台審部五字第1100061265號書函。二、所詢疑義，依法務部108年11月29日法律字第10803517910號函（如附件，公開於法務部主管法規查詢系統）說明三載有「財團法人與董事、監察人間之法律關係，司法實務及學者多數認其法律性質類似民法上委任契約之一種無名契約，應類推適用民法委任之規定」，爰如個案採購受評廠商為財團法人，而採購評選委員會委員曾於3年內擔任該財團法人之董事或監察人，該委員屬採購評選委員會審議規則第14條第2款所定情形，應即辭職或予以解聘。</w:t>
+        <w:t>主旨：有關採購評選委員會審議規則第14條規定之適用疑義，本會意見如說明，請查照。</w:t>
+      </w:r>
+    </w:p>
+    <w:p>
+      <w:pPr>
+        <w:pStyle w:val="a9"/>
+        <w:ind w:left="720" w:hanging="720"/>
+        <w:jc w:val="both"/>
+      </w:pPr>
+      <w:r>
+        <w:rPr>
+          <w:rFonts w:ascii="新細明體" w:hAnsi="新細明體" w:eastAsia="新細明體"/>
+          <w:b w:val="0"/>
+          <w:sz w:val="24"/>
+        </w:rPr>
+        <w:t>說明：</w:t>
+      </w:r>
+    </w:p>
+    <w:p>
+      <w:pPr>
+        <w:pStyle w:val="a9"/>
+        <w:ind w:left="720" w:hanging="480"/>
+        <w:jc w:val="both"/>
+      </w:pPr>
+      <w:r>
+        <w:rPr>
+          <w:rFonts w:ascii="新細明體" w:hAnsi="新細明體" w:eastAsia="新細明體"/>
+          <w:b w:val="0"/>
+          <w:sz w:val="24"/>
+        </w:rPr>
+        <w:t>一、復貴部110年8月4日台審部五字第1100061265號書函。</w:t>
+      </w:r>
+    </w:p>
+    <w:p>
+      <w:pPr>
+        <w:pStyle w:val="a9"/>
+        <w:ind w:left="720" w:hanging="480"/>
+        <w:jc w:val="both"/>
+      </w:pPr>
+      <w:r>
+        <w:rPr>
+          <w:rFonts w:ascii="新細明體" w:hAnsi="新細明體" w:eastAsia="新細明體"/>
+          <w:b w:val="0"/>
+          <w:sz w:val="24"/>
+        </w:rPr>
+        <w:t>二、所詢疑義，依法務部108年11月29日法律字第10803517910號函（如附件，公開於法務部主管法規查詢系統）說明三載有「財團法人與董事、監察人間之法律關係，司法實務及學者多數認其法律性質類似民法上委任契約之一種無名契約，應類推適用民法委任之規定」，爰如個案採購受評廠商為財團法人，而採購評選委員會委員曾於3年內擔任該財團法人之董事或監察人，該委員屬採購評選委員會審議規則第14條第2款所定情形，應即辭職或予以解聘。</w:t>
       </w:r>
     </w:p>
     <w:p/>
@@ -8368,7 +8518,67 @@
           <w:b w:val="0"/>
           <w:sz w:val="24"/>
         </w:rPr>
-        <w:t>主旨：機關辦理採購評選之作業程序，請妥為安排，避免機關人員、評選委員及廠商不及因應，召集人並應妥善維持採購評選會議秩序，俾使採購評選程序順利進行，請查照並轉知所屬。說明：一、邇來少數採購個案，因有機關未妥適安排採購評選會議作業程序，致廠商於會場久候多時情形，且評選委員會議進行中機關未適時維持會場秩序，發生評選委員交談或音量過大干擾廠商簡報等，招致廠商質疑有影響評選公正性之虞。二、政府採購法第1條規定：「為建立政府採購制度，依公平、公開之採購程序，提升採購效率與功能，確保採購品質，爰制定本法。」機關基於提升採購效率、確保採購品質及兼顧各參與者之時間成本，應妥善規劃執行細節，並應避免（亦不宜於招標文件預先載明）臨時變更原評選程序之內容（例如若符合資格廠商家數少，將二階段評選併為一階段），造成廠商不及因應或須在場久候之情形。三、依採購評選委員會審議規則第6條第1項規定：「委員應公正辦理評選。評選及出席會議，應親自為之，不得代理，且應參與評分（比）。」採購評選委員會委員須知第8點：「委員評選及出席會議，應全程參與......」第9點第3項：「委員對於不同廠商之詢問及態度，不得為無正當理由之差別待遇......」為確保評選之公正性，並避免引發廠商質疑，廠商進行簡報時，評選委員應全程參與並專心聆聽。召集人（依本會110年11月11日工程企字第1100101893令修正發布之採購評選委員會組織準則第7條規定，為機關指派，其目的為確保評選委員會確實依議程進行，採購評選委員依據評分項目及機關需求，務實評選可行方案）亦應確實維持評選會議秩序。</w:t>
+        <w:t>主旨：機關辦理採購評選之作業程序，請妥為安排，避免機關人員、評選委員及廠商不及因應，召集人並應妥善維持採購評選會議秩序，俾使採購評選程序順利進行，請查照並轉知所屬。</w:t>
+      </w:r>
+    </w:p>
+    <w:p>
+      <w:pPr>
+        <w:pStyle w:val="a9"/>
+        <w:ind w:left="720" w:hanging="720"/>
+        <w:jc w:val="both"/>
+      </w:pPr>
+      <w:r>
+        <w:rPr>
+          <w:rFonts w:ascii="新細明體" w:hAnsi="新細明體" w:eastAsia="新細明體"/>
+          <w:b w:val="0"/>
+          <w:sz w:val="24"/>
+        </w:rPr>
+        <w:t>說明：</w:t>
+      </w:r>
+    </w:p>
+    <w:p>
+      <w:pPr>
+        <w:pStyle w:val="a9"/>
+        <w:ind w:left="720" w:hanging="480"/>
+        <w:jc w:val="both"/>
+      </w:pPr>
+      <w:r>
+        <w:rPr>
+          <w:rFonts w:ascii="新細明體" w:hAnsi="新細明體" w:eastAsia="新細明體"/>
+          <w:b w:val="0"/>
+          <w:sz w:val="24"/>
+        </w:rPr>
+        <w:t>一、邇來少數採購個案，因有機關未妥適安排採購評選會議作業程序，致廠商於會場久候多時情形，且評選委員會議進行中機關未適時維持會場秩序，發生評選委員交談或音量過大干擾廠商簡報等，招致廠商質疑有影響評選公正性之虞。</w:t>
+      </w:r>
+    </w:p>
+    <w:p>
+      <w:pPr>
+        <w:pStyle w:val="a9"/>
+        <w:ind w:left="720" w:hanging="480"/>
+        <w:jc w:val="both"/>
+      </w:pPr>
+      <w:r>
+        <w:rPr>
+          <w:rFonts w:ascii="新細明體" w:hAnsi="新細明體" w:eastAsia="新細明體"/>
+          <w:b w:val="0"/>
+          <w:sz w:val="24"/>
+        </w:rPr>
+        <w:t>二、政府採購法第1條規定：「為建立政府採購制度，依公平、公開之採購程序，提升採購效率與功能，確保採購品質，爰制定本法。」機關基於提升採購效率、確保採購品質及兼顧各參與者之時間成本，應妥善規劃執行細節，並應避免（亦不宜於招標文件預先載明）臨時變更原評選程序之內容（例如若符合資格廠商家數少，將二階段評選併為一階段），造成廠商不及因應或須在場久候之情形。</w:t>
+      </w:r>
+    </w:p>
+    <w:p>
+      <w:pPr>
+        <w:pStyle w:val="a9"/>
+        <w:ind w:left="720" w:hanging="480"/>
+        <w:jc w:val="both"/>
+      </w:pPr>
+      <w:r>
+        <w:rPr>
+          <w:rFonts w:ascii="新細明體" w:hAnsi="新細明體" w:eastAsia="新細明體"/>
+          <w:b w:val="0"/>
+          <w:sz w:val="24"/>
+        </w:rPr>
+        <w:t>三、依採購評選委員會審議規則第6條第1項規定：「委員應公正辦理評選。評選及出席會議，應親自為之，不得代理，且應參與評分（比）。」採購評選委員會委員須知第8點：「委員評選及出席會議，應全程參與......」第9點第3項：「委員對於不同廠商之詢問及態度，不得為無正當理由之差別待遇......」為確保評選之公正性，並避免引發廠商質疑，廠商進行簡報時，評選委員應全程參與並專心聆聽。召集人（依本會110年11月11日工程企字第1100101893令修正發布之採購評選委員會組織準則第7條規定，為機關指派，其目的為確保評選委員會確實依議程進行，採購評選委員依據評分項目及機關需求，務實評選可行方案）亦應確實維持評選會議秩序。</w:t>
       </w:r>
     </w:p>
     <w:p/>
@@ -8399,7 +8609,67 @@
           <w:b w:val="0"/>
           <w:sz w:val="24"/>
         </w:rPr>
-        <w:t>主旨：政府電子採購網業已新增功能，機關辦理採購得以投標廠商「負責人名稱」查詢其擔任負責人之其他廠商是否遭刊登政府採購公報拒絕往來，請查照並轉知所屬。說明：一、為防範停權廠商於拒絕往來期間，其負責人意圖規避採購法而另以其其他廠商名義參與政府採購，政府電子採購網業新增旨揭功能，俾利機關辦理採購採評選或評分方式審查者，得將之納入評選考量，以擇選優良廠商。二、工程廠商之負責人以另成立之其他廠商參與競標，機關亦可透過本會工程履歷資料瞭解該相同負責人之廠商過去履約情形，比照將之納入評選考量。三、旨揭功能操作請至政府電子採購網登入：「機關端/採購輔助/廠商管理/拒絕往來廠商/查詢作業」項下，輸入負責人姓名查詢。</w:t>
+        <w:t>主旨：政府電子採購網業已新增功能，機關辦理採購得以投標廠商「負責人名稱」查詢其擔任負責人之其他廠商是否遭刊登政府採購公報拒絕往來，請查照並轉知所屬。</w:t>
+      </w:r>
+    </w:p>
+    <w:p>
+      <w:pPr>
+        <w:pStyle w:val="a9"/>
+        <w:ind w:left="720" w:hanging="720"/>
+        <w:jc w:val="both"/>
+      </w:pPr>
+      <w:r>
+        <w:rPr>
+          <w:rFonts w:ascii="新細明體" w:hAnsi="新細明體" w:eastAsia="新細明體"/>
+          <w:b w:val="0"/>
+          <w:sz w:val="24"/>
+        </w:rPr>
+        <w:t>說明：</w:t>
+      </w:r>
+    </w:p>
+    <w:p>
+      <w:pPr>
+        <w:pStyle w:val="a9"/>
+        <w:ind w:left="720" w:hanging="480"/>
+        <w:jc w:val="both"/>
+      </w:pPr>
+      <w:r>
+        <w:rPr>
+          <w:rFonts w:ascii="新細明體" w:hAnsi="新細明體" w:eastAsia="新細明體"/>
+          <w:b w:val="0"/>
+          <w:sz w:val="24"/>
+        </w:rPr>
+        <w:t>一、為防範停權廠商於拒絕往來期間，其負責人意圖規避採購法而另以其其他廠商名義參與政府採購，政府電子採購網業新增旨揭功能，俾利機關辦理採購採評選或評分方式審查者，得將之納入評選考量，以擇選優良廠商。</w:t>
+      </w:r>
+    </w:p>
+    <w:p>
+      <w:pPr>
+        <w:pStyle w:val="a9"/>
+        <w:ind w:left="720" w:hanging="480"/>
+        <w:jc w:val="both"/>
+      </w:pPr>
+      <w:r>
+        <w:rPr>
+          <w:rFonts w:ascii="新細明體" w:hAnsi="新細明體" w:eastAsia="新細明體"/>
+          <w:b w:val="0"/>
+          <w:sz w:val="24"/>
+        </w:rPr>
+        <w:t>二、工程廠商之負責人以另成立之其他廠商參與競標，機關亦可透過本會工程履歷資料瞭解該相同負責人之廠商過去履約情形，比照將之納入評選考量。</w:t>
+      </w:r>
+    </w:p>
+    <w:p>
+      <w:pPr>
+        <w:pStyle w:val="a9"/>
+        <w:ind w:left="720" w:hanging="480"/>
+        <w:jc w:val="both"/>
+      </w:pPr>
+      <w:r>
+        <w:rPr>
+          <w:rFonts w:ascii="新細明體" w:hAnsi="新細明體" w:eastAsia="新細明體"/>
+          <w:b w:val="0"/>
+          <w:sz w:val="24"/>
+        </w:rPr>
+        <w:t>三、旨揭功能操作請至政府電子採購網登入：「機關端/採購輔助/廠商管理/拒絕往來廠商/查詢作業」項下，輸入負責人姓名查詢。</w:t>
       </w:r>
     </w:p>
     <w:p/>
@@ -8693,61 +8963,61 @@
     <w:p>
       <w:pPr>
         <w:pStyle w:val="a9"/>
-        <w:ind w:left="1225" w:hanging="397"/>
-        <w:jc w:val="both"/>
-      </w:pPr>
-      <w:r>
-        <w:rPr>
-          <w:rFonts w:ascii="新細明體" w:hAnsi="新細明體" w:eastAsia="新細明體"/>
-          <w:b w:val="0"/>
-          <w:sz w:val="24"/>
-        </w:rPr>
-        <w:t>1.復貴所八十八年五月十二日八八壽鄉建字第五一〇四號函。</w:t>
-      </w:r>
-    </w:p>
-    <w:p>
-      <w:pPr>
-        <w:pStyle w:val="a9"/>
-        <w:ind w:left="1225" w:hanging="397"/>
-        <w:jc w:val="both"/>
-      </w:pPr>
-      <w:r>
-        <w:rPr>
-          <w:rFonts w:ascii="新細明體" w:hAnsi="新細明體" w:eastAsia="新細明體"/>
-          <w:b w:val="0"/>
-          <w:sz w:val="24"/>
-        </w:rPr>
-        <w:t>2.「政府採購法」（以下簡稱本法）第十八條第四項限制性招標，係指直接邀請廠商比價或議價，其適用條件應符合本法第二十二條第一項各款之規定，其中第一款所稱公開招標辦理結果，不受三次以上流標之限制。</w:t>
-      </w:r>
-    </w:p>
-    <w:p>
-      <w:pPr>
-        <w:pStyle w:val="a9"/>
-        <w:ind w:left="1225" w:hanging="397"/>
-        <w:jc w:val="both"/>
-      </w:pPr>
-      <w:r>
-        <w:rPr>
-          <w:rFonts w:ascii="新細明體" w:hAnsi="新細明體" w:eastAsia="新細明體"/>
-          <w:b w:val="0"/>
-          <w:sz w:val="24"/>
-        </w:rPr>
-        <w:t>3.本法第二十一條關於選擇性招標之合格廠商，指符合一定資格條件之廠商；所稱平等受邀，如係為特定個案辦理者，應邀請所有符合資格之廠商投標；如屬經常性採購，應於資格審查之文件中載明邀標方式及家數。</w:t>
-      </w:r>
-    </w:p>
-    <w:p>
-      <w:pPr>
-        <w:pStyle w:val="a9"/>
-        <w:ind w:left="1225" w:hanging="397"/>
-        <w:jc w:val="both"/>
-      </w:pPr>
-      <w:r>
-        <w:rPr>
-          <w:rFonts w:ascii="新細明體" w:hAnsi="新細明體" w:eastAsia="新細明體"/>
-          <w:b w:val="0"/>
-          <w:sz w:val="24"/>
-        </w:rPr>
-        <w:t>4.依本法第五十八條決標予次低標時，如最低標廠商無本法第三十一條第二項各款之情形，其所繳押標金應予退還。</w:t>
+        <w:ind w:left="720" w:hanging="480"/>
+        <w:jc w:val="both"/>
+      </w:pPr>
+      <w:r>
+        <w:rPr>
+          <w:rFonts w:ascii="新細明體" w:hAnsi="新細明體" w:eastAsia="新細明體"/>
+          <w:b w:val="0"/>
+          <w:sz w:val="24"/>
+        </w:rPr>
+        <w:t>一、復貴所八十八年五月十二日八八壽鄉建字第五一〇四號函。</w:t>
+      </w:r>
+    </w:p>
+    <w:p>
+      <w:pPr>
+        <w:pStyle w:val="a9"/>
+        <w:ind w:left="720" w:hanging="480"/>
+        <w:jc w:val="both"/>
+      </w:pPr>
+      <w:r>
+        <w:rPr>
+          <w:rFonts w:ascii="新細明體" w:hAnsi="新細明體" w:eastAsia="新細明體"/>
+          <w:b w:val="0"/>
+          <w:sz w:val="24"/>
+        </w:rPr>
+        <w:t>二、「政府採購法」（以下簡稱本法）第十八條第四項限制性招標，係指直接邀請廠商比價或議價，其適用條件應符合本法第二十二條第一項各款之規定，其中第一款所稱公開招標辦理結果，不受三次以上流標之限制。</w:t>
+      </w:r>
+    </w:p>
+    <w:p>
+      <w:pPr>
+        <w:pStyle w:val="a9"/>
+        <w:ind w:left="720" w:hanging="480"/>
+        <w:jc w:val="both"/>
+      </w:pPr>
+      <w:r>
+        <w:rPr>
+          <w:rFonts w:ascii="新細明體" w:hAnsi="新細明體" w:eastAsia="新細明體"/>
+          <w:b w:val="0"/>
+          <w:sz w:val="24"/>
+        </w:rPr>
+        <w:t>三、本法第二十一條關於選擇性招標之合格廠商，指符合一定資格條件之廠商；所稱平等受邀，如係為特定個案辦理者，應邀請所有符合資格之廠商投標；如屬經常性採購，應於資格審查之文件中載明邀標方式及家數。</w:t>
+      </w:r>
+    </w:p>
+    <w:p>
+      <w:pPr>
+        <w:pStyle w:val="a9"/>
+        <w:ind w:left="720" w:hanging="480"/>
+        <w:jc w:val="both"/>
+      </w:pPr>
+      <w:r>
+        <w:rPr>
+          <w:rFonts w:ascii="新細明體" w:hAnsi="新細明體" w:eastAsia="新細明體"/>
+          <w:b w:val="0"/>
+          <w:sz w:val="24"/>
+        </w:rPr>
+        <w:t>四、依本法第五十八條決標予次低標時，如最低標廠商無本法第三十一條第二項各款之情形，其所繳押標金應予退還。</w:t>
       </w:r>
     </w:p>
     <w:p/>
@@ -9112,7 +9382,7 @@
           <w:b w:val="0"/>
           <w:sz w:val="24"/>
         </w:rPr>
-        <w:t>備註：1. 「註」：「押標金保證金暨其他擔保作業辦法」業經本會九十一年三月二十六日工程企字第九一〇一一七五四號令修正公布，本函說明二後段第三十條第一項規定內容配合調整，並請參考本會八十九年十二月十一日（八九）工程企字第八九〇三六七三七號函頒「依政府採購法第五十八條處理標價偏低於底價百分之八十案件之執行程序」。</w:t>
+        <w:t>備註：1. 「押標金保證金暨其他擔保作業辦法」業經本會九十一年三月二十六日工程企字第九一〇一一七五四號令修正公布，本函說明二後段第三十條第一項規定內容配合調整，並請參考本會八十九年十二月十一日（八九）工程企字第八九〇三六七三七號函頒「依政府採購法第五十八條處理標價偏低於底價百分之八十案件之執行程序」。</w:t>
       </w:r>
     </w:p>
     <w:p>
@@ -9128,21 +9398,6 @@
           <w:sz w:val="24"/>
         </w:rPr>
         <w:t>2. 依政府採購法第58條處理總標價低於底價百分之八十案件之執行程序，業經本會100年8月22日工程企字第10000261091號令增修附註執行原則第8點，並經同日以工程企字第10000261094號通函各機關。</w:t>
-      </w:r>
-    </w:p>
-    <w:p>
-      <w:pPr>
-        <w:pStyle w:val="a9"/>
-        <w:ind w:left="960" w:hanging="240"/>
-        <w:jc w:val="both"/>
-      </w:pPr>
-      <w:r>
-        <w:rPr>
-          <w:rFonts w:ascii="新細明體" w:hAnsi="新細明體" w:eastAsia="新細明體"/>
-          <w:b w:val="0"/>
-          <w:sz w:val="24"/>
-        </w:rPr>
-        <w:t>3. 「註」：「押標金保證金暨其他擔保作業辦法」業經本會九十一年三月二十六日工程企字第九一○一一七五四號令修正公布，本函說明二後段第三十條第一項規定內容配合調整，並請參考本會八十九年十二月十一日（八九）工程企字第八九○三六七三七號函頒「依政府採購法第五十八條處理標價偏低於底價百分之八十案件之執行程序」。</w:t>
       </w:r>
     </w:p>
     <w:p/>
@@ -9293,7 +9548,7 @@
           <w:b w:val="0"/>
           <w:sz w:val="24"/>
         </w:rPr>
-        <w:t>備註：1. 「註」：依九十一年二月六日總統華總一義字第０九一０００二五六一０令修正公布政府採購法部分條文，本函說明三所述「….第一百零一條所規定十三款情形….」配合修正為「….第一百零一條所規定十四款情形….」。</w:t>
+        <w:t>備註：1. 依九十一年二月六日總統華總一義字第０九一０００二五六一０令修正公布政府採購法部分條文，本函說明三所述「….第一百零一條所規定十三款情形….」配合修正為「….第一百零一條所規定十四款情形….」。</w:t>
       </w:r>
     </w:p>
     <w:p>
@@ -9308,7 +9563,22 @@
           <w:b w:val="0"/>
           <w:sz w:val="24"/>
         </w:rPr>
-        <w:t>2. 依政府採購法第58條處理總標價低於底價百分之八十案件之執行程序，業經本會100年8月22日工程企字第10000261091號令增修附註執行原則第8點，並經同日以工程企字第10000261094號通函各機關。註：108年5月22日總統華總一義字第10800049691號令修正政府採購法第101條第1項，計15款。</w:t>
+        <w:t>2. 依政府採購法第58條處理總標價低於底價百分之八十案件之執行程序，業經本會100年8月22日工程企字第10000261091號令增修附註執行原則第8點，並經同日以工程企字第10000261094號通函各機關。</w:t>
+      </w:r>
+    </w:p>
+    <w:p>
+      <w:pPr>
+        <w:pStyle w:val="a9"/>
+        <w:ind w:left="960" w:hanging="240"/>
+        <w:jc w:val="both"/>
+      </w:pPr>
+      <w:r>
+        <w:rPr>
+          <w:rFonts w:ascii="新細明體" w:hAnsi="新細明體" w:eastAsia="新細明體"/>
+          <w:b w:val="0"/>
+          <w:sz w:val="24"/>
+        </w:rPr>
+        <w:t>3. 108年5月22日總統華總一義字第10800049691號令修正政府採購法第101條第1項，計15款。</w:t>
       </w:r>
     </w:p>
     <w:p/>
@@ -9976,22 +10246,7 @@
           <w:b w:val="0"/>
           <w:sz w:val="24"/>
         </w:rPr>
-        <w:t>二、關於來函說明二前二問題，廠商於限期內提出</w:t>
-      </w:r>
-    </w:p>
-    <w:p>
-      <w:pPr>
-        <w:pStyle w:val="a9"/>
-        <w:ind w:left="720" w:hanging="720"/>
-        <w:jc w:val="both"/>
-      </w:pPr>
-      <w:r>
-        <w:rPr>
-          <w:rFonts w:ascii="新細明體" w:hAnsi="新細明體" w:eastAsia="新細明體"/>
-          <w:b w:val="0"/>
-          <w:sz w:val="24"/>
-        </w:rPr>
-        <w:t>說明：</w:t>
+        <w:t>二、關於來函說明二前二問題，廠商於限期內提出說明：</w:t>
       </w:r>
     </w:p>
     <w:p>
@@ -10006,7 +10261,7 @@
           <w:b w:val="0"/>
           <w:sz w:val="24"/>
         </w:rPr>
-        <w:t>（一）機關認為廠商提出之說明並不合理者，得不決標予該廠商。機關如有其他考量，而欲再通知該廠商於另一期限內提出差額保證金之擔保，以憑辦理決標者，尚無不可，惟應審酌其妥適性，例如該廠商過去之履約情形、目前之營運狀況與提供擔保及履約之意願。</w:t>
+        <w:t>（一）機關認為廠商提出之說明並不合理者，得不決標予該廠商。機關如有其他考量，而欲再通知該廠商於另一期限內提出差額保證金之擔保，以憑辦理決標者，尚無不可，惟應審酌其妥適性，例如該廠商過去之履約情形、目前之營運狀況與提供擔保及履約之意願。</w:t>
       </w:r>
     </w:p>
     <w:p>
@@ -10066,37 +10321,7 @@
           <w:b w:val="0"/>
           <w:sz w:val="24"/>
         </w:rPr>
-        <w:t>五、檢附本會網站登載之下列相關解釋函，併請查照：</w:t>
-      </w:r>
-    </w:p>
-    <w:p>
-      <w:pPr>
-        <w:pStyle w:val="a9"/>
-        <w:ind w:left="964" w:hanging="680"/>
-        <w:jc w:val="both"/>
-      </w:pPr>
-      <w:r>
-        <w:rPr>
-          <w:rFonts w:ascii="新細明體" w:hAnsi="新細明體" w:eastAsia="新細明體"/>
-          <w:b w:val="0"/>
-          <w:sz w:val="24"/>
-        </w:rPr>
-        <w:t>（一）八十八年五月二十八日（八八）工程企字第八八〇六六九九號函；</w:t>
-      </w:r>
-    </w:p>
-    <w:p>
-      <w:pPr>
-        <w:pStyle w:val="a9"/>
-        <w:ind w:left="964" w:hanging="680"/>
-        <w:jc w:val="both"/>
-      </w:pPr>
-      <w:r>
-        <w:rPr>
-          <w:rFonts w:ascii="新細明體" w:hAnsi="新細明體" w:eastAsia="新細明體"/>
-          <w:b w:val="0"/>
-          <w:sz w:val="24"/>
-        </w:rPr>
-        <w:t>（二）八十八年七月十七日（八八）工程企字第八八一〇〇九二號函；及(三)八十八年十月十二日（八八）工程企字第八八一四六六八號函。</w:t>
+        <w:t>五、檢附本會網站登載之下列相關解釋函，併請查照：(一)八十八年五月二十八日（八八）工程企字第八八〇六六九九號函；(二)八十八年七月十七日（八八）工程企字第八八一〇〇九二號函；及(三)八十八年十月十二日（八八）工程企字第八八一四六六八號函。</w:t>
       </w:r>
     </w:p>
     <w:p/>
@@ -11113,7 +11338,22 @@
           <w:b w:val="0"/>
           <w:sz w:val="24"/>
         </w:rPr>
-        <w:t>二、關於貴部98年2月25日函，本會先前未收到該函，經通知貴部收發單位補發後，已於6月4日收到電子公文。三、目前系統介接處理情形，說明如下：</w:t>
+        <w:t>二、關於貴部98年2月25日函，本會先前未收到該函，經通知貴部收發單位補發後，已於6月4日收到電子公文。</w:t>
+      </w:r>
+    </w:p>
+    <w:p>
+      <w:pPr>
+        <w:pStyle w:val="a9"/>
+        <w:ind w:left="720" w:hanging="480"/>
+        <w:jc w:val="both"/>
+      </w:pPr>
+      <w:r>
+        <w:rPr>
+          <w:rFonts w:ascii="新細明體" w:hAnsi="新細明體" w:eastAsia="新細明體"/>
+          <w:b w:val="0"/>
+          <w:sz w:val="24"/>
+        </w:rPr>
+        <w:t>三、目前系統介接處理情形，說明如下：</w:t>
       </w:r>
     </w:p>
     <w:p>
@@ -11158,7 +11398,22 @@
           <w:b w:val="0"/>
           <w:sz w:val="24"/>
         </w:rPr>
-        <w:t>（三）本會電子投開標及決標作業與內政部營建署「營造業登記資料查詢系統」介接，已完成系統介接申請及交換資訊格式確認，程式開發已納入本會進行中之第2代政府電子採購網，預計於99年1月1日上線，屆時可由程式自動檢核以避免經撤銷登記或受停業處分仍得標公共工程之情形。四、目前開標前及決標公告作業程序之檢核機制如下：</w:t>
+        <w:t>（三）本會電子投開標及決標作業與內政部營建署「營造業登記資料查詢系統」介接，已完成系統介接申請及交換資訊格式確認，程式開發已納入本會進行中之第2代政府電子採購網，預計於99年1月1日上線，屆時可由程式自動檢核以避免經撤銷登記或受停業處分仍得標公共工程之情形。</w:t>
+      </w:r>
+    </w:p>
+    <w:p>
+      <w:pPr>
+        <w:pStyle w:val="a9"/>
+        <w:ind w:left="720" w:hanging="480"/>
+        <w:jc w:val="both"/>
+      </w:pPr>
+      <w:r>
+        <w:rPr>
+          <w:rFonts w:ascii="新細明體" w:hAnsi="新細明體" w:eastAsia="新細明體"/>
+          <w:b w:val="0"/>
+          <w:sz w:val="24"/>
+        </w:rPr>
+        <w:t>四、目前開標前及決標公告作業程序之檢核機制如下：</w:t>
       </w:r>
     </w:p>
     <w:p>

</xml_diff>

<commit_message>
Update manual corrections to Chapter 5 DOCX and JSON
</commit_message>
<xml_diff>
--- a/第五章/第五章.docx
+++ b/第五章/第五章.docx
@@ -8640,24 +8640,7 @@
           <w:rFonts w:ascii="新細明體" w:eastAsia="新細明體" w:hAnsi="新細明體"/>
           <w:lang w:eastAsia="zh-TW"/>
         </w:rPr>
-        <w:t>四、採購法第50條第1項第5款規定：「投標廠商有下列情形之一，經機關於開標前發現者，其所投之標應不予開標；於開標後發現者，應不決標予該廠商：</w:t>
-      </w:r>
-    </w:p>
-    <w:p>
-      <w:pPr>
-        <w:pStyle w:val="a9"/>
-        <w:ind w:hanging="480"/>
-        <w:jc w:val="both"/>
-        <w:rPr>
-          <w:lang w:eastAsia="zh-TW"/>
-        </w:rPr>
-      </w:pPr>
-      <w:r>
-        <w:rPr>
-          <w:rFonts w:ascii="新細明體" w:eastAsia="新細明體" w:hAnsi="新細明體"/>
-          <w:lang w:eastAsia="zh-TW"/>
-        </w:rPr>
-        <w:t>五、不同投標廠商間之投標文件內容有重大異常關聯。」係91年2月6日所增訂，立法理由係為防止假性競爭行為，個案有無該款情形，係以參與該採購案之不同投標廠商間有無假性競爭情形為判斷。</w:t>
+        <w:t>四、採購法第50條第1項第5款規定：「投標廠商有下列情形之一，經機關於開標前發現者，其所投之標應不予開標；於開標後發現者，應不決標予該廠商：五、不同投標廠商間之投標文件內容有重大異常關聯。」係91年2月6日所增訂，立法理由係為防止假性競爭行為，個案有無該款情形，係以參與該採購案之不同投標廠商間有無假性競爭情形為判斷。</w:t>
       </w:r>
     </w:p>
     <w:p>
@@ -10476,7 +10459,7 @@
         <w:ind w:hanging="720"/>
         <w:jc w:val="both"/>
         <w:rPr>
-          <w:rFonts w:ascii="新細明體" w:eastAsia="新細明體" w:hAnsi="新細明體" w:hint="eastAsia"/>
+          <w:rFonts w:ascii="新細明體" w:eastAsia="新細明體" w:hAnsi="新細明體"/>
           <w:lang w:eastAsia="zh-TW"/>
         </w:rPr>
       </w:pPr>
@@ -10510,12 +10493,6 @@
         <w:gridCol w:w="7862"/>
       </w:tblGrid>
       <w:tr>
-        <w:tblPrEx>
-          <w:tblCellMar>
-            <w:top w:w="0" w:type="dxa"/>
-            <w:bottom w:w="0" w:type="dxa"/>
-          </w:tblCellMar>
-        </w:tblPrEx>
         <w:trPr>
           <w:cantSplit/>
           <w:tblHeader/>
@@ -10531,7 +10508,7 @@
               <w:spacing w:after="0" w:line="400" w:lineRule="exact"/>
               <w:jc w:val="center"/>
               <w:rPr>
-                <w:rFonts w:ascii="新細明體" w:eastAsia="新細明體" w:hAnsi="新細明體" w:cs="Times New Roman" w:hint="eastAsia"/>
+                <w:rFonts w:ascii="新細明體" w:eastAsia="新細明體" w:hAnsi="新細明體" w:cs="Times New Roman"/>
                 <w:color w:val="000000"/>
                 <w:kern w:val="2"/>
                 <w:szCs w:val="24"/>
@@ -10561,7 +10538,7 @@
               <w:spacing w:after="0" w:line="400" w:lineRule="exact"/>
               <w:jc w:val="center"/>
               <w:rPr>
-                <w:rFonts w:ascii="新細明體" w:eastAsia="新細明體" w:hAnsi="新細明體" w:cs="Times New Roman" w:hint="eastAsia"/>
+                <w:rFonts w:ascii="新細明體" w:eastAsia="新細明體" w:hAnsi="新細明體" w:cs="Times New Roman"/>
                 <w:color w:val="000000"/>
                 <w:kern w:val="2"/>
                 <w:szCs w:val="24"/>
@@ -10582,12 +10559,6 @@
         </w:tc>
       </w:tr>
       <w:tr>
-        <w:tblPrEx>
-          <w:tblCellMar>
-            <w:top w:w="0" w:type="dxa"/>
-            <w:bottom w:w="0" w:type="dxa"/>
-          </w:tblCellMar>
-        </w:tblPrEx>
         <w:trPr>
           <w:trHeight w:val="1562"/>
         </w:trPr>
@@ -10606,7 +10577,7 @@
               <w:ind w:leftChars="-13" w:left="147" w:rightChars="24" w:right="58" w:hangingChars="74" w:hanging="178"/>
               <w:jc w:val="both"/>
               <w:rPr>
-                <w:rFonts w:ascii="新細明體" w:eastAsia="新細明體" w:hAnsi="新細明體" w:cs="Times New Roman" w:hint="eastAsia"/>
+                <w:rFonts w:ascii="新細明體" w:eastAsia="新細明體" w:hAnsi="新細明體" w:cs="Times New Roman"/>
                 <w:color w:val="000000"/>
                 <w:kern w:val="2"/>
                 <w:szCs w:val="24"/>
@@ -10647,7 +10618,7 @@
               <w:jc w:val="both"/>
               <w:textAlignment w:val="baseline"/>
               <w:rPr>
-                <w:rFonts w:ascii="新細明體" w:eastAsia="新細明體" w:hAnsi="新細明體" w:cs="Times New Roman" w:hint="eastAsia"/>
+                <w:rFonts w:ascii="新細明體" w:eastAsia="新細明體" w:hAnsi="新細明體" w:cs="Times New Roman"/>
                 <w:bCs/>
                 <w:noProof/>
                 <w:color w:val="000000"/>
@@ -10680,7 +10651,7 @@
               <w:jc w:val="both"/>
               <w:textAlignment w:val="baseline"/>
               <w:rPr>
-                <w:rFonts w:ascii="新細明體" w:eastAsia="新細明體" w:hAnsi="新細明體" w:cs="Times New Roman" w:hint="eastAsia"/>
+                <w:rFonts w:ascii="新細明體" w:eastAsia="新細明體" w:hAnsi="新細明體" w:cs="Times New Roman"/>
                 <w:bCs/>
                 <w:noProof/>
                 <w:color w:val="000000"/>
@@ -10727,7 +10698,7 @@
               <w:jc w:val="both"/>
               <w:textAlignment w:val="baseline"/>
               <w:rPr>
-                <w:rFonts w:ascii="新細明體" w:eastAsia="新細明體" w:hAnsi="新細明體" w:cs="Times New Roman" w:hint="eastAsia"/>
+                <w:rFonts w:ascii="新細明體" w:eastAsia="新細明體" w:hAnsi="新細明體" w:cs="Times New Roman"/>
                 <w:noProof/>
                 <w:color w:val="000000"/>
                 <w:szCs w:val="24"/>
@@ -10825,7 +10796,7 @@
               <w:jc w:val="both"/>
               <w:textAlignment w:val="baseline"/>
               <w:rPr>
-                <w:rFonts w:ascii="新細明體" w:eastAsia="新細明體" w:hAnsi="新細明體" w:cs="Times New Roman" w:hint="eastAsia"/>
+                <w:rFonts w:ascii="新細明體" w:eastAsia="新細明體" w:hAnsi="新細明體" w:cs="Times New Roman"/>
                 <w:noProof/>
                 <w:color w:val="000000"/>
                 <w:szCs w:val="24"/>
@@ -10873,7 +10844,7 @@
               <w:jc w:val="both"/>
               <w:textAlignment w:val="baseline"/>
               <w:rPr>
-                <w:rFonts w:ascii="新細明體" w:eastAsia="新細明體" w:hAnsi="新細明體" w:cs="Times New Roman" w:hint="eastAsia"/>
+                <w:rFonts w:ascii="新細明體" w:eastAsia="新細明體" w:hAnsi="新細明體" w:cs="Times New Roman"/>
                 <w:noProof/>
                 <w:color w:val="000000"/>
                 <w:szCs w:val="24"/>
@@ -10952,7 +10923,7 @@
               <w:jc w:val="both"/>
               <w:textAlignment w:val="baseline"/>
               <w:rPr>
-                <w:rFonts w:ascii="新細明體" w:eastAsia="新細明體" w:hAnsi="新細明體" w:cs="Times New Roman" w:hint="eastAsia"/>
+                <w:rFonts w:ascii="新細明體" w:eastAsia="新細明體" w:hAnsi="新細明體" w:cs="Times New Roman"/>
                 <w:noProof/>
                 <w:color w:val="000000"/>
                 <w:szCs w:val="24"/>
@@ -10998,7 +10969,7 @@
               <w:jc w:val="both"/>
               <w:textAlignment w:val="baseline"/>
               <w:rPr>
-                <w:rFonts w:ascii="新細明體" w:eastAsia="新細明體" w:hAnsi="新細明體" w:cs="Times New Roman" w:hint="eastAsia"/>
+                <w:rFonts w:ascii="新細明體" w:eastAsia="新細明體" w:hAnsi="新細明體" w:cs="Times New Roman"/>
                 <w:noProof/>
                 <w:color w:val="000000"/>
                 <w:szCs w:val="24"/>
@@ -11033,7 +11004,7 @@
               <w:jc w:val="both"/>
               <w:textAlignment w:val="baseline"/>
               <w:rPr>
-                <w:rFonts w:ascii="新細明體" w:eastAsia="新細明體" w:hAnsi="新細明體" w:cs="Times New Roman" w:hint="eastAsia"/>
+                <w:rFonts w:ascii="新細明體" w:eastAsia="新細明體" w:hAnsi="新細明體" w:cs="Times New Roman"/>
                 <w:noProof/>
                 <w:color w:val="000000"/>
                 <w:szCs w:val="24"/>
@@ -11131,7 +11102,7 @@
               <w:jc w:val="both"/>
               <w:textAlignment w:val="baseline"/>
               <w:rPr>
-                <w:rFonts w:ascii="新細明體" w:eastAsia="新細明體" w:hAnsi="新細明體" w:cs="Times New Roman" w:hint="eastAsia"/>
+                <w:rFonts w:ascii="新細明體" w:eastAsia="新細明體" w:hAnsi="新細明體" w:cs="Times New Roman"/>
                 <w:noProof/>
                 <w:color w:val="000000"/>
                 <w:szCs w:val="24"/>
@@ -11165,7 +11136,7 @@
               <w:jc w:val="both"/>
               <w:textAlignment w:val="baseline"/>
               <w:rPr>
-                <w:rFonts w:ascii="新細明體" w:eastAsia="新細明體" w:hAnsi="新細明體" w:cs="Times New Roman" w:hint="eastAsia"/>
+                <w:rFonts w:ascii="新細明體" w:eastAsia="新細明體" w:hAnsi="新細明體" w:cs="Times New Roman"/>
                 <w:noProof/>
                 <w:color w:val="000000"/>
                 <w:szCs w:val="24"/>
@@ -11260,7 +11231,7 @@
               <w:jc w:val="both"/>
               <w:textAlignment w:val="baseline"/>
               <w:rPr>
-                <w:rFonts w:ascii="新細明體" w:eastAsia="新細明體" w:hAnsi="新細明體" w:cs="Times New Roman" w:hint="eastAsia"/>
+                <w:rFonts w:ascii="新細明體" w:eastAsia="新細明體" w:hAnsi="新細明體" w:cs="Times New Roman"/>
                 <w:noProof/>
                 <w:color w:val="000000"/>
                 <w:szCs w:val="24"/>
@@ -11382,7 +11353,7 @@
               <w:jc w:val="both"/>
               <w:textAlignment w:val="baseline"/>
               <w:rPr>
-                <w:rFonts w:ascii="新細明體" w:eastAsia="新細明體" w:hAnsi="新細明體" w:cs="Times New Roman" w:hint="eastAsia"/>
+                <w:rFonts w:ascii="新細明體" w:eastAsia="新細明體" w:hAnsi="新細明體" w:cs="Times New Roman"/>
                 <w:noProof/>
                 <w:color w:val="000000"/>
                 <w:szCs w:val="24"/>
@@ -11553,7 +11524,7 @@
               <w:jc w:val="both"/>
               <w:textAlignment w:val="baseline"/>
               <w:rPr>
-                <w:rFonts w:ascii="新細明體" w:eastAsia="新細明體" w:hAnsi="新細明體" w:cs="Times New Roman" w:hint="eastAsia"/>
+                <w:rFonts w:ascii="新細明體" w:eastAsia="新細明體" w:hAnsi="新細明體" w:cs="Times New Roman"/>
                 <w:noProof/>
                 <w:color w:val="000000"/>
                 <w:szCs w:val="24"/>
@@ -11641,7 +11612,7 @@
               <w:jc w:val="both"/>
               <w:textAlignment w:val="baseline"/>
               <w:rPr>
-                <w:rFonts w:ascii="新細明體" w:eastAsia="新細明體" w:hAnsi="新細明體" w:cs="Times New Roman" w:hint="eastAsia"/>
+                <w:rFonts w:ascii="新細明體" w:eastAsia="新細明體" w:hAnsi="新細明體" w:cs="Times New Roman"/>
                 <w:noProof/>
                 <w:color w:val="000000"/>
                 <w:szCs w:val="24"/>
@@ -11854,7 +11825,7 @@
               <w:jc w:val="both"/>
               <w:textAlignment w:val="baseline"/>
               <w:rPr>
-                <w:rFonts w:ascii="新細明體" w:eastAsia="新細明體" w:hAnsi="新細明體" w:cs="Times New Roman" w:hint="eastAsia"/>
+                <w:rFonts w:ascii="新細明體" w:eastAsia="新細明體" w:hAnsi="新細明體" w:cs="Times New Roman"/>
                 <w:noProof/>
                 <w:color w:val="000000"/>
                 <w:szCs w:val="24"/>
@@ -12047,12 +12018,6 @@
         </w:tc>
       </w:tr>
       <w:tr>
-        <w:tblPrEx>
-          <w:tblCellMar>
-            <w:top w:w="0" w:type="dxa"/>
-            <w:bottom w:w="0" w:type="dxa"/>
-          </w:tblCellMar>
-        </w:tblPrEx>
         <w:trPr>
           <w:trHeight w:val="1267"/>
         </w:trPr>
@@ -12071,7 +12036,7 @@
               <w:ind w:leftChars="-13" w:left="147" w:rightChars="24" w:right="58" w:hangingChars="74" w:hanging="178"/>
               <w:jc w:val="both"/>
               <w:rPr>
-                <w:rFonts w:ascii="新細明體" w:eastAsia="新細明體" w:hAnsi="新細明體" w:cs="Times New Roman" w:hint="eastAsia"/>
+                <w:rFonts w:ascii="新細明體" w:eastAsia="新細明體" w:hAnsi="新細明體" w:cs="Times New Roman"/>
                 <w:color w:val="000000"/>
                 <w:kern w:val="2"/>
                 <w:szCs w:val="24"/>
@@ -12112,7 +12077,7 @@
               <w:jc w:val="both"/>
               <w:textAlignment w:val="baseline"/>
               <w:rPr>
-                <w:rFonts w:ascii="新細明體" w:eastAsia="新細明體" w:hAnsi="新細明體" w:cs="Times New Roman" w:hint="eastAsia"/>
+                <w:rFonts w:ascii="新細明體" w:eastAsia="新細明體" w:hAnsi="新細明體" w:cs="Times New Roman"/>
                 <w:noProof/>
                 <w:color w:val="000000"/>
                 <w:szCs w:val="24"/>
@@ -12147,7 +12112,7 @@
               <w:jc w:val="both"/>
               <w:textAlignment w:val="baseline"/>
               <w:rPr>
-                <w:rFonts w:ascii="新細明體" w:eastAsia="新細明體" w:hAnsi="新細明體" w:cs="Times New Roman" w:hint="eastAsia"/>
+                <w:rFonts w:ascii="新細明體" w:eastAsia="新細明體" w:hAnsi="新細明體" w:cs="Times New Roman"/>
                 <w:noProof/>
                 <w:color w:val="000000"/>
                 <w:szCs w:val="24"/>
@@ -12182,7 +12147,7 @@
               <w:jc w:val="both"/>
               <w:textAlignment w:val="baseline"/>
               <w:rPr>
-                <w:rFonts w:ascii="新細明體" w:eastAsia="新細明體" w:hAnsi="新細明體" w:cs="Times New Roman" w:hint="eastAsia"/>
+                <w:rFonts w:ascii="新細明體" w:eastAsia="新細明體" w:hAnsi="新細明體" w:cs="Times New Roman"/>
                 <w:noProof/>
                 <w:color w:val="000000"/>
                 <w:szCs w:val="24"/>
@@ -12203,12 +12168,6 @@
         </w:tc>
       </w:tr>
       <w:tr>
-        <w:tblPrEx>
-          <w:tblCellMar>
-            <w:top w:w="0" w:type="dxa"/>
-            <w:bottom w:w="0" w:type="dxa"/>
-          </w:tblCellMar>
-        </w:tblPrEx>
         <w:trPr>
           <w:trHeight w:val="760"/>
         </w:trPr>
@@ -12227,7 +12186,7 @@
               <w:ind w:left="154" w:rightChars="24" w:right="58" w:hangingChars="64" w:hanging="154"/>
               <w:jc w:val="both"/>
               <w:rPr>
-                <w:rFonts w:ascii="新細明體" w:eastAsia="新細明體" w:hAnsi="新細明體" w:cs="Times New Roman" w:hint="eastAsia"/>
+                <w:rFonts w:ascii="新細明體" w:eastAsia="新細明體" w:hAnsi="新細明體" w:cs="Times New Roman"/>
                 <w:color w:val="000000"/>
                 <w:kern w:val="2"/>
                 <w:szCs w:val="24"/>
@@ -12266,7 +12225,7 @@
               <w:ind w:left="692" w:hanging="692"/>
               <w:jc w:val="both"/>
               <w:rPr>
-                <w:rFonts w:ascii="新細明體" w:eastAsia="新細明體" w:hAnsi="新細明體" w:cs="Times New Roman" w:hint="eastAsia"/>
+                <w:rFonts w:ascii="新細明體" w:eastAsia="新細明體" w:hAnsi="新細明體" w:cs="Times New Roman"/>
                 <w:color w:val="000000"/>
                 <w:kern w:val="2"/>
                 <w:szCs w:val="24"/>
@@ -12330,7 +12289,7 @@
               <w:ind w:left="692" w:hanging="692"/>
               <w:jc w:val="both"/>
               <w:rPr>
-                <w:rFonts w:ascii="新細明體" w:eastAsia="新細明體" w:hAnsi="新細明體" w:cs="Times New Roman" w:hint="eastAsia"/>
+                <w:rFonts w:ascii="新細明體" w:eastAsia="新細明體" w:hAnsi="新細明體" w:cs="Times New Roman"/>
                 <w:color w:val="000000"/>
                 <w:kern w:val="2"/>
                 <w:szCs w:val="24"/>
@@ -12374,7 +12333,7 @@
               <w:ind w:left="692" w:hanging="692"/>
               <w:jc w:val="both"/>
               <w:rPr>
-                <w:rFonts w:ascii="新細明體" w:eastAsia="新細明體" w:hAnsi="新細明體" w:cs="Times New Roman" w:hint="eastAsia"/>
+                <w:rFonts w:ascii="新細明體" w:eastAsia="新細明體" w:hAnsi="新細明體" w:cs="Times New Roman"/>
                 <w:color w:val="000000"/>
                 <w:kern w:val="2"/>
                 <w:szCs w:val="24"/>
@@ -12395,12 +12354,6 @@
         </w:tc>
       </w:tr>
       <w:tr>
-        <w:tblPrEx>
-          <w:tblCellMar>
-            <w:top w:w="0" w:type="dxa"/>
-            <w:bottom w:w="0" w:type="dxa"/>
-          </w:tblCellMar>
-        </w:tblPrEx>
         <w:trPr>
           <w:trHeight w:val="3212"/>
         </w:trPr>
@@ -12419,7 +12372,7 @@
               <w:ind w:leftChars="-13" w:left="147" w:rightChars="24" w:right="58" w:hangingChars="74" w:hanging="178"/>
               <w:jc w:val="both"/>
               <w:rPr>
-                <w:rFonts w:ascii="新細明體" w:eastAsia="新細明體" w:hAnsi="新細明體" w:cs="Times New Roman" w:hint="eastAsia"/>
+                <w:rFonts w:ascii="新細明體" w:eastAsia="新細明體" w:hAnsi="新細明體" w:cs="Times New Roman"/>
                 <w:color w:val="000000"/>
                 <w:kern w:val="2"/>
                 <w:szCs w:val="24"/>
@@ -12459,7 +12412,7 @@
               <w:jc w:val="both"/>
               <w:textAlignment w:val="baseline"/>
               <w:rPr>
-                <w:rFonts w:ascii="新細明體" w:eastAsia="新細明體" w:hAnsi="新細明體" w:cs="Times New Roman" w:hint="eastAsia"/>
+                <w:rFonts w:ascii="新細明體" w:eastAsia="新細明體" w:hAnsi="新細明體" w:cs="Times New Roman"/>
                 <w:noProof/>
                 <w:color w:val="000000"/>
                 <w:szCs w:val="24"/>
@@ -12514,7 +12467,7 @@
               <w:jc w:val="both"/>
               <w:textAlignment w:val="baseline"/>
               <w:rPr>
-                <w:rFonts w:ascii="新細明體" w:eastAsia="新細明體" w:hAnsi="新細明體" w:cs="Times New Roman" w:hint="eastAsia"/>
+                <w:rFonts w:ascii="新細明體" w:eastAsia="新細明體" w:hAnsi="新細明體" w:cs="Times New Roman"/>
                 <w:noProof/>
                 <w:color w:val="000000"/>
                 <w:szCs w:val="24"/>
@@ -12545,12 +12498,6 @@
         </w:tc>
       </w:tr>
       <w:tr>
-        <w:tblPrEx>
-          <w:tblCellMar>
-            <w:top w:w="0" w:type="dxa"/>
-            <w:bottom w:w="0" w:type="dxa"/>
-          </w:tblCellMar>
-        </w:tblPrEx>
         <w:trPr>
           <w:trHeight w:val="833"/>
         </w:trPr>
@@ -12569,7 +12516,7 @@
               <w:ind w:leftChars="-13" w:left="147" w:rightChars="24" w:right="58" w:hangingChars="74" w:hanging="178"/>
               <w:jc w:val="both"/>
               <w:rPr>
-                <w:rFonts w:ascii="新細明體" w:eastAsia="新細明體" w:hAnsi="新細明體" w:cs="Times New Roman" w:hint="eastAsia"/>
+                <w:rFonts w:ascii="新細明體" w:eastAsia="新細明體" w:hAnsi="新細明體" w:cs="Times New Roman"/>
                 <w:color w:val="000000"/>
                 <w:kern w:val="2"/>
                 <w:szCs w:val="24"/>
@@ -12608,7 +12555,7 @@
               <w:ind w:left="692" w:hanging="692"/>
               <w:jc w:val="both"/>
               <w:rPr>
-                <w:rFonts w:ascii="新細明體" w:eastAsia="新細明體" w:hAnsi="新細明體" w:cs="Times New Roman" w:hint="eastAsia"/>
+                <w:rFonts w:ascii="新細明體" w:eastAsia="新細明體" w:hAnsi="新細明體" w:cs="Times New Roman"/>
                 <w:color w:val="000000"/>
                 <w:kern w:val="2"/>
                 <w:szCs w:val="24"/>
@@ -12652,7 +12599,7 @@
               <w:ind w:left="692" w:hanging="692"/>
               <w:jc w:val="both"/>
               <w:rPr>
-                <w:rFonts w:ascii="新細明體" w:eastAsia="新細明體" w:hAnsi="新細明體" w:cs="Times New Roman" w:hint="eastAsia"/>
+                <w:rFonts w:ascii="新細明體" w:eastAsia="新細明體" w:hAnsi="新細明體" w:cs="Times New Roman"/>
                 <w:color w:val="000000"/>
                 <w:kern w:val="2"/>
                 <w:szCs w:val="24"/>
@@ -12717,7 +12664,7 @@
               <w:ind w:left="692" w:hanging="692"/>
               <w:jc w:val="both"/>
               <w:rPr>
-                <w:rFonts w:ascii="新細明體" w:eastAsia="新細明體" w:hAnsi="新細明體" w:cs="Times New Roman" w:hint="eastAsia"/>
+                <w:rFonts w:ascii="新細明體" w:eastAsia="新細明體" w:hAnsi="新細明體" w:cs="Times New Roman"/>
                 <w:color w:val="000000"/>
                 <w:kern w:val="2"/>
                 <w:szCs w:val="24"/>
@@ -12750,7 +12697,7 @@
               <w:ind w:left="692" w:hanging="692"/>
               <w:jc w:val="both"/>
               <w:rPr>
-                <w:rFonts w:ascii="新細明體" w:eastAsia="新細明體" w:hAnsi="新細明體" w:cs="Times New Roman" w:hint="eastAsia"/>
+                <w:rFonts w:ascii="新細明體" w:eastAsia="新細明體" w:hAnsi="新細明體" w:cs="Times New Roman"/>
                 <w:color w:val="000000"/>
                 <w:kern w:val="2"/>
                 <w:szCs w:val="24"/>
@@ -12825,7 +12772,7 @@
               <w:ind w:left="692" w:hanging="692"/>
               <w:jc w:val="both"/>
               <w:rPr>
-                <w:rFonts w:ascii="新細明體" w:eastAsia="新細明體" w:hAnsi="新細明體" w:cs="Times New Roman" w:hint="eastAsia"/>
+                <w:rFonts w:ascii="新細明體" w:eastAsia="新細明體" w:hAnsi="新細明體" w:cs="Times New Roman"/>
                 <w:color w:val="000000"/>
                 <w:kern w:val="2"/>
                 <w:szCs w:val="24"/>
@@ -12858,7 +12805,7 @@
               <w:ind w:left="692" w:hanging="692"/>
               <w:jc w:val="both"/>
               <w:rPr>
-                <w:rFonts w:ascii="新細明體" w:eastAsia="新細明體" w:hAnsi="新細明體" w:cs="Times New Roman" w:hint="eastAsia"/>
+                <w:rFonts w:ascii="新細明體" w:eastAsia="新細明體" w:hAnsi="新細明體" w:cs="Times New Roman"/>
                 <w:color w:val="000000"/>
                 <w:kern w:val="2"/>
                 <w:szCs w:val="24"/>
@@ -12909,12 +12856,6 @@
         </w:tc>
       </w:tr>
       <w:tr>
-        <w:tblPrEx>
-          <w:tblCellMar>
-            <w:top w:w="0" w:type="dxa"/>
-            <w:bottom w:w="0" w:type="dxa"/>
-          </w:tblCellMar>
-        </w:tblPrEx>
         <w:trPr>
           <w:trHeight w:val="862"/>
         </w:trPr>
@@ -12933,7 +12874,7 @@
               <w:ind w:leftChars="-13" w:left="147" w:rightChars="24" w:right="58" w:hangingChars="74" w:hanging="178"/>
               <w:jc w:val="both"/>
               <w:rPr>
-                <w:rFonts w:ascii="新細明體" w:eastAsia="新細明體" w:hAnsi="新細明體" w:cs="Times New Roman" w:hint="eastAsia"/>
+                <w:rFonts w:ascii="新細明體" w:eastAsia="新細明體" w:hAnsi="新細明體" w:cs="Times New Roman"/>
                 <w:color w:val="000000"/>
                 <w:kern w:val="2"/>
                 <w:szCs w:val="24"/>
@@ -12970,7 +12911,7 @@
               <w:jc w:val="both"/>
               <w:textAlignment w:val="baseline"/>
               <w:rPr>
-                <w:rFonts w:ascii="新細明體" w:eastAsia="新細明體" w:hAnsi="新細明體" w:cs="Times New Roman" w:hint="eastAsia"/>
+                <w:rFonts w:ascii="新細明體" w:eastAsia="新細明體" w:hAnsi="新細明體" w:cs="Times New Roman"/>
                 <w:noProof/>
                 <w:color w:val="000000"/>
                 <w:szCs w:val="24"/>
@@ -20100,7 +20041,6 @@
         <w:ind w:hanging="720"/>
         <w:jc w:val="both"/>
         <w:rPr>
-          <w:rFonts w:hint="eastAsia"/>
           <w:lang w:eastAsia="zh-TW"/>
         </w:rPr>
       </w:pPr>
@@ -21929,6 +21869,7 @@
   <w:style w:type="character" w:default="1" w:styleId="a0">
     <w:name w:val="Default Paragraph Font"/>
     <w:uiPriority w:val="1"/>
+    <w:semiHidden/>
     <w:unhideWhenUsed/>
   </w:style>
   <w:style w:type="table" w:default="1" w:styleId="a1">

</xml_diff>